<commit_message>
Update Deliverable 1 Template.docx
</commit_message>
<xml_diff>
--- a/Deliverable 1 Template.docx
+++ b/Deliverable 1 Template.docx
@@ -5,8 +5,16 @@
     <w:p>
       <w:pPr>
         <w:jc w:val="center"/>
+        <w:rPr>
+          <w:sz w:val="28"/>
+          <w:szCs w:val="28"/>
+        </w:rPr>
       </w:pPr>
       <w:r>
+        <w:rPr>
+          <w:sz w:val="28"/>
+          <w:szCs w:val="28"/>
+        </w:rPr>
         <w:t>ΕΡΓΑΣΙΑ ΣΤΟ ΜΑΘΗΜΑ ΒΑΣΕΙΣ ΔΕΔΟΜΕΝΩΝ</w:t>
       </w:r>
     </w:p>
@@ -201,17 +209,20 @@
       <w:pPr>
         <w:rPr>
           <w:b/>
+          <w:u w:val="single"/>
         </w:rPr>
       </w:pPr>
       <w:r>
         <w:rPr>
           <w:b/>
+          <w:u w:val="single"/>
         </w:rPr>
         <w:t xml:space="preserve">Αριθμός Ομάδας </w:t>
       </w:r>
       <w:r>
         <w:rPr>
           <w:b/>
+          <w:u w:val="single"/>
         </w:rPr>
         <w:t>19</w:t>
       </w:r>
@@ -343,7 +354,19 @@
         <w:t xml:space="preserve"> Ι</w:t>
       </w:r>
       <w:r>
-        <w:t>ωάννα- Ινώ</w:t>
+        <w:t>ωάννα</w:t>
+      </w:r>
+      <w:r>
+        <w:t xml:space="preserve"> </w:t>
+      </w:r>
+      <w:r>
+        <w:t>-</w:t>
+      </w:r>
+      <w:r>
+        <w:t xml:space="preserve"> </w:t>
+      </w:r>
+      <w:r>
+        <w:t>Ινώ</w:t>
       </w:r>
       <w:r>
         <w:tab/>
@@ -413,8 +436,6 @@
           <w:b/>
           <w:bCs/>
           <w:kern w:val="32"/>
-          <w:sz w:val="32"/>
-          <w:szCs w:val="32"/>
         </w:rPr>
       </w:pPr>
       <w:r>
@@ -474,7 +495,7 @@
           <w:r>
             <w:fldChar w:fldCharType="separate"/>
           </w:r>
-          <w:hyperlink w:anchor="_Toc528749143" w:history="1">
+          <w:hyperlink w:anchor="_Toc214200079" w:history="1">
             <w:r>
               <w:rPr>
                 <w:rStyle w:val="-"/>
@@ -518,7 +539,7 @@
                 <w:noProof/>
                 <w:webHidden/>
               </w:rPr>
-              <w:instrText xml:space="preserve"> PAGEREF _Toc528749143 \h </w:instrText>
+              <w:instrText xml:space="preserve"> PAGEREF _Toc214200079 \h </w:instrText>
             </w:r>
             <w:r>
               <w:rPr>
@@ -564,7 +585,7 @@
               <w:lang w:eastAsia="el-GR"/>
             </w:rPr>
           </w:pPr>
-          <w:hyperlink w:anchor="_Toc528749144" w:history="1">
+          <w:hyperlink w:anchor="_Toc214200080" w:history="1">
             <w:r>
               <w:rPr>
                 <w:rStyle w:val="-"/>
@@ -608,7 +629,7 @@
                 <w:noProof/>
                 <w:webHidden/>
               </w:rPr>
-              <w:instrText xml:space="preserve"> PAGEREF _Toc528749144 \h </w:instrText>
+              <w:instrText xml:space="preserve"> PAGEREF _Toc214200080 \h </w:instrText>
             </w:r>
             <w:r>
               <w:rPr>
@@ -654,7 +675,7 @@
               <w:lang w:eastAsia="el-GR"/>
             </w:rPr>
           </w:pPr>
-          <w:hyperlink w:anchor="_Toc528749145" w:history="1">
+          <w:hyperlink w:anchor="_Toc214200081" w:history="1">
             <w:r>
               <w:rPr>
                 <w:rStyle w:val="-"/>
@@ -698,7 +719,7 @@
                 <w:noProof/>
                 <w:webHidden/>
               </w:rPr>
-              <w:instrText xml:space="preserve"> PAGEREF _Toc528749145 \h </w:instrText>
+              <w:instrText xml:space="preserve"> PAGEREF _Toc214200081 \h </w:instrText>
             </w:r>
             <w:r>
               <w:rPr>
@@ -744,7 +765,7 @@
               <w:lang w:eastAsia="el-GR"/>
             </w:rPr>
           </w:pPr>
-          <w:hyperlink w:anchor="_Toc528749146" w:history="1">
+          <w:hyperlink w:anchor="_Toc214200082" w:history="1">
             <w:r>
               <w:rPr>
                 <w:rStyle w:val="-"/>
@@ -788,7 +809,7 @@
                 <w:noProof/>
                 <w:webHidden/>
               </w:rPr>
-              <w:instrText xml:space="preserve"> PAGEREF _Toc528749146 \h </w:instrText>
+              <w:instrText xml:space="preserve"> PAGEREF _Toc214200082 \h </w:instrText>
             </w:r>
             <w:r>
               <w:rPr>
@@ -830,7 +851,7 @@
               <w:lang w:eastAsia="el-GR"/>
             </w:rPr>
           </w:pPr>
-          <w:hyperlink w:anchor="_Toc528749147" w:history="1">
+          <w:hyperlink w:anchor="_Toc214200083" w:history="1">
             <w:r>
               <w:rPr>
                 <w:rStyle w:val="-"/>
@@ -874,7 +895,7 @@
                 <w:noProof/>
                 <w:webHidden/>
               </w:rPr>
-              <w:instrText xml:space="preserve"> PAGEREF _Toc528749147 \h </w:instrText>
+              <w:instrText xml:space="preserve"> PAGEREF _Toc214200083 \h </w:instrText>
             </w:r>
             <w:r>
               <w:rPr>
@@ -894,7 +915,7 @@
                 <w:noProof/>
                 <w:webHidden/>
               </w:rPr>
-              <w:t>4</w:t>
+              <w:t>5</w:t>
             </w:r>
             <w:r>
               <w:rPr>
@@ -916,7 +937,7 @@
               <w:lang w:eastAsia="el-GR"/>
             </w:rPr>
           </w:pPr>
-          <w:hyperlink w:anchor="_Toc528749148" w:history="1">
+          <w:hyperlink w:anchor="_Toc214200084" w:history="1">
             <w:r>
               <w:rPr>
                 <w:rStyle w:val="-"/>
@@ -960,7 +981,7 @@
                 <w:noProof/>
                 <w:webHidden/>
               </w:rPr>
-              <w:instrText xml:space="preserve"> PAGEREF _Toc528749148 \h </w:instrText>
+              <w:instrText xml:space="preserve"> PAGEREF _Toc214200084 \h </w:instrText>
             </w:r>
             <w:r>
               <w:rPr>
@@ -980,7 +1001,7 @@
                 <w:noProof/>
                 <w:webHidden/>
               </w:rPr>
-              <w:t>5</w:t>
+              <w:t>6</w:t>
             </w:r>
             <w:r>
               <w:rPr>
@@ -1006,7 +1027,7 @@
               <w:lang w:eastAsia="el-GR"/>
             </w:rPr>
           </w:pPr>
-          <w:hyperlink w:anchor="_Toc528749149" w:history="1">
+          <w:hyperlink w:anchor="_Toc214200085" w:history="1">
             <w:r>
               <w:rPr>
                 <w:rStyle w:val="-"/>
@@ -1050,7 +1071,7 @@
                 <w:noProof/>
                 <w:webHidden/>
               </w:rPr>
-              <w:instrText xml:space="preserve"> PAGEREF _Toc528749149 \h </w:instrText>
+              <w:instrText xml:space="preserve"> PAGEREF _Toc214200085 \h </w:instrText>
             </w:r>
             <w:r>
               <w:rPr>
@@ -1070,7 +1091,7 @@
                 <w:noProof/>
                 <w:webHidden/>
               </w:rPr>
-              <w:t>5</w:t>
+              <w:t>6</w:t>
             </w:r>
             <w:r>
               <w:rPr>
@@ -1096,7 +1117,7 @@
               <w:lang w:eastAsia="el-GR"/>
             </w:rPr>
           </w:pPr>
-          <w:hyperlink w:anchor="_Toc528749150" w:history="1">
+          <w:hyperlink w:anchor="_Toc214200086" w:history="1">
             <w:r>
               <w:rPr>
                 <w:rStyle w:val="-"/>
@@ -1140,7 +1161,7 @@
                 <w:noProof/>
                 <w:webHidden/>
               </w:rPr>
-              <w:instrText xml:space="preserve"> PAGEREF _Toc528749150 \h </w:instrText>
+              <w:instrText xml:space="preserve"> PAGEREF _Toc214200086 \h </w:instrText>
             </w:r>
             <w:r>
               <w:rPr>
@@ -1160,7 +1181,7 @@
                 <w:noProof/>
                 <w:webHidden/>
               </w:rPr>
-              <w:t>5</w:t>
+              <w:t>6</w:t>
             </w:r>
             <w:r>
               <w:rPr>
@@ -1186,7 +1207,7 @@
               <w:lang w:eastAsia="el-GR"/>
             </w:rPr>
           </w:pPr>
-          <w:hyperlink w:anchor="_Toc528749151" w:history="1">
+          <w:hyperlink w:anchor="_Toc214200087" w:history="1">
             <w:r>
               <w:rPr>
                 <w:rStyle w:val="-"/>
@@ -1230,7 +1251,7 @@
                 <w:noProof/>
                 <w:webHidden/>
               </w:rPr>
-              <w:instrText xml:space="preserve"> PAGEREF _Toc528749151 \h </w:instrText>
+              <w:instrText xml:space="preserve"> PAGEREF _Toc214200087 \h </w:instrText>
             </w:r>
             <w:r>
               <w:rPr>
@@ -1250,7 +1271,7 @@
                 <w:noProof/>
                 <w:webHidden/>
               </w:rPr>
-              <w:t>5</w:t>
+              <w:t>8</w:t>
             </w:r>
             <w:r>
               <w:rPr>
@@ -1276,7 +1297,7 @@
               <w:lang w:eastAsia="el-GR"/>
             </w:rPr>
           </w:pPr>
-          <w:hyperlink w:anchor="_Toc528749152" w:history="1">
+          <w:hyperlink w:anchor="_Toc214200088" w:history="1">
             <w:r>
               <w:rPr>
                 <w:rStyle w:val="-"/>
@@ -1320,7 +1341,7 @@
                 <w:noProof/>
                 <w:webHidden/>
               </w:rPr>
-              <w:instrText xml:space="preserve"> PAGEREF _Toc528749152 \h </w:instrText>
+              <w:instrText xml:space="preserve"> PAGEREF _Toc214200088 \h </w:instrText>
             </w:r>
             <w:r>
               <w:rPr>
@@ -1340,7 +1361,7 @@
                 <w:noProof/>
                 <w:webHidden/>
               </w:rPr>
-              <w:t>6</w:t>
+              <w:t>10</w:t>
             </w:r>
             <w:r>
               <w:rPr>
@@ -1362,7 +1383,7 @@
               <w:lang w:eastAsia="el-GR"/>
             </w:rPr>
           </w:pPr>
-          <w:hyperlink w:anchor="_Toc528749153" w:history="1">
+          <w:hyperlink w:anchor="_Toc214200089" w:history="1">
             <w:r>
               <w:rPr>
                 <w:rStyle w:val="-"/>
@@ -1406,7 +1427,7 @@
                 <w:noProof/>
                 <w:webHidden/>
               </w:rPr>
-              <w:instrText xml:space="preserve"> PAGEREF _Toc528749153 \h </w:instrText>
+              <w:instrText xml:space="preserve"> PAGEREF _Toc214200089 \h </w:instrText>
             </w:r>
             <w:r>
               <w:rPr>
@@ -1426,7 +1447,7 @@
                 <w:noProof/>
                 <w:webHidden/>
               </w:rPr>
-              <w:t>7</w:t>
+              <w:t>11</w:t>
             </w:r>
             <w:r>
               <w:rPr>
@@ -1452,7 +1473,7 @@
               <w:lang w:eastAsia="el-GR"/>
             </w:rPr>
           </w:pPr>
-          <w:hyperlink w:anchor="_Toc528749154" w:history="1">
+          <w:hyperlink w:anchor="_Toc214200090" w:history="1">
             <w:r>
               <w:rPr>
                 <w:rStyle w:val="-"/>
@@ -1496,7 +1517,7 @@
                 <w:noProof/>
                 <w:webHidden/>
               </w:rPr>
-              <w:instrText xml:space="preserve"> PAGEREF _Toc528749154 \h </w:instrText>
+              <w:instrText xml:space="preserve"> PAGEREF _Toc214200090 \h </w:instrText>
             </w:r>
             <w:r>
               <w:rPr>
@@ -1516,7 +1537,7 @@
                 <w:noProof/>
                 <w:webHidden/>
               </w:rPr>
-              <w:t>7</w:t>
+              <w:t>11</w:t>
             </w:r>
             <w:r>
               <w:rPr>
@@ -1542,7 +1563,7 @@
               <w:lang w:eastAsia="el-GR"/>
             </w:rPr>
           </w:pPr>
-          <w:hyperlink w:anchor="_Toc528749155" w:history="1">
+          <w:hyperlink w:anchor="_Toc214200091" w:history="1">
             <w:r>
               <w:rPr>
                 <w:rStyle w:val="-"/>
@@ -1586,7 +1607,7 @@
                 <w:noProof/>
                 <w:webHidden/>
               </w:rPr>
-              <w:instrText xml:space="preserve"> PAGEREF _Toc528749155 \h </w:instrText>
+              <w:instrText xml:space="preserve"> PAGEREF _Toc214200091 \h </w:instrText>
             </w:r>
             <w:r>
               <w:rPr>
@@ -1606,7 +1627,7 @@
                 <w:noProof/>
                 <w:webHidden/>
               </w:rPr>
-              <w:t>7</w:t>
+              <w:t>11</w:t>
             </w:r>
             <w:r>
               <w:rPr>
@@ -1632,7 +1653,7 @@
               <w:lang w:eastAsia="el-GR"/>
             </w:rPr>
           </w:pPr>
-          <w:hyperlink w:anchor="_Toc528749156" w:history="1">
+          <w:hyperlink w:anchor="_Toc214200092" w:history="1">
             <w:r>
               <w:rPr>
                 <w:rStyle w:val="-"/>
@@ -1655,7 +1676,7 @@
                 <w:rStyle w:val="-"/>
                 <w:noProof/>
               </w:rPr>
-              <w:t>Σχεσιακό Διάγραμμα</w:t>
+              <w:t>Σχεσιακό Σχήμα</w:t>
             </w:r>
             <w:r>
               <w:rPr>
@@ -1676,7 +1697,7 @@
                 <w:noProof/>
                 <w:webHidden/>
               </w:rPr>
-              <w:instrText xml:space="preserve"> PAGEREF _Toc528749156 \h </w:instrText>
+              <w:instrText xml:space="preserve"> PAGEREF _Toc214200092 \h </w:instrText>
             </w:r>
             <w:r>
               <w:rPr>
@@ -1696,7 +1717,7 @@
                 <w:noProof/>
                 <w:webHidden/>
               </w:rPr>
-              <w:t>7</w:t>
+              <w:t>11</w:t>
             </w:r>
             <w:r>
               <w:rPr>
@@ -1722,7 +1743,7 @@
               <w:lang w:eastAsia="el-GR"/>
             </w:rPr>
           </w:pPr>
-          <w:hyperlink w:anchor="_Toc528749157" w:history="1">
+          <w:hyperlink w:anchor="_Toc214200093" w:history="1">
             <w:r>
               <w:rPr>
                 <w:rStyle w:val="-"/>
@@ -1766,7 +1787,7 @@
                 <w:noProof/>
                 <w:webHidden/>
               </w:rPr>
-              <w:instrText xml:space="preserve"> PAGEREF _Toc528749157 \h </w:instrText>
+              <w:instrText xml:space="preserve"> PAGEREF _Toc214200093 \h </w:instrText>
             </w:r>
             <w:r>
               <w:rPr>
@@ -1786,7 +1807,7 @@
                 <w:noProof/>
                 <w:webHidden/>
               </w:rPr>
-              <w:t>8</w:t>
+              <w:t>12</w:t>
             </w:r>
             <w:r>
               <w:rPr>
@@ -1808,7 +1829,7 @@
               <w:lang w:eastAsia="el-GR"/>
             </w:rPr>
           </w:pPr>
-          <w:hyperlink w:anchor="_Toc528749158" w:history="1">
+          <w:hyperlink w:anchor="_Toc214200094" w:history="1">
             <w:r>
               <w:rPr>
                 <w:rStyle w:val="-"/>
@@ -1852,7 +1873,7 @@
                 <w:noProof/>
                 <w:webHidden/>
               </w:rPr>
-              <w:instrText xml:space="preserve"> PAGEREF _Toc528749158 \h </w:instrText>
+              <w:instrText xml:space="preserve"> PAGEREF _Toc214200094 \h </w:instrText>
             </w:r>
             <w:r>
               <w:rPr>
@@ -1872,7 +1893,7 @@
                 <w:noProof/>
                 <w:webHidden/>
               </w:rPr>
-              <w:t>9</w:t>
+              <w:t>13</w:t>
             </w:r>
             <w:r>
               <w:rPr>
@@ -1898,7 +1919,7 @@
               <w:lang w:eastAsia="el-GR"/>
             </w:rPr>
           </w:pPr>
-          <w:hyperlink w:anchor="_Toc528749159" w:history="1">
+          <w:hyperlink w:anchor="_Toc214200095" w:history="1">
             <w:r>
               <w:rPr>
                 <w:rStyle w:val="-"/>
@@ -1942,7 +1963,7 @@
                 <w:noProof/>
                 <w:webHidden/>
               </w:rPr>
-              <w:instrText xml:space="preserve"> PAGEREF _Toc528749159 \h </w:instrText>
+              <w:instrText xml:space="preserve"> PAGEREF _Toc214200095 \h </w:instrText>
             </w:r>
             <w:r>
               <w:rPr>
@@ -1962,7 +1983,7 @@
                 <w:noProof/>
                 <w:webHidden/>
               </w:rPr>
-              <w:t>9</w:t>
+              <w:t>13</w:t>
             </w:r>
             <w:r>
               <w:rPr>
@@ -1988,7 +2009,7 @@
               <w:lang w:eastAsia="el-GR"/>
             </w:rPr>
           </w:pPr>
-          <w:hyperlink w:anchor="_Toc528749160" w:history="1">
+          <w:hyperlink w:anchor="_Toc214200096" w:history="1">
             <w:r>
               <w:rPr>
                 <w:rStyle w:val="-"/>
@@ -2032,7 +2053,7 @@
                 <w:noProof/>
                 <w:webHidden/>
               </w:rPr>
-              <w:instrText xml:space="preserve"> PAGEREF _Toc528749160 \h </w:instrText>
+              <w:instrText xml:space="preserve"> PAGEREF _Toc214200096 \h </w:instrText>
             </w:r>
             <w:r>
               <w:rPr>
@@ -2052,7 +2073,7 @@
                 <w:noProof/>
                 <w:webHidden/>
               </w:rPr>
-              <w:t>9</w:t>
+              <w:t>13</w:t>
             </w:r>
             <w:r>
               <w:rPr>
@@ -2095,7 +2116,7 @@
       <w:pPr>
         <w:pStyle w:val="1"/>
       </w:pPr>
-      <w:bookmarkStart w:id="0" w:name="_Toc528749143"/>
+      <w:bookmarkStart w:id="0" w:name="_Toc214200079"/>
       <w:r>
         <w:lastRenderedPageBreak/>
         <w:t>Εισαγωγή</w:t>
@@ -2106,7 +2127,7 @@
       <w:pPr>
         <w:pStyle w:val="2"/>
       </w:pPr>
-      <w:bookmarkStart w:id="1" w:name="_Toc528749144"/>
+      <w:bookmarkStart w:id="1" w:name="_Toc214200080"/>
       <w:r>
         <w:t>Σκοπός Εφαρμογής</w:t>
       </w:r>
@@ -2254,6 +2275,14 @@
           <w:kern w:val="28"/>
         </w:rPr>
         <w:t xml:space="preserve">η κατασκευή μιας Βάσης Δεδομένων που θα περιέχει </w:t>
+      </w:r>
+      <w:r>
+        <w:rPr>
+          <w:rFonts w:eastAsiaTheme="majorEastAsia" w:cstheme="minorHAnsi"/>
+          <w:bCs/>
+          <w:kern w:val="28"/>
+        </w:rPr>
+        <w:t xml:space="preserve">συγκεντρωμένα τα </w:t>
       </w:r>
       <w:r>
         <w:rPr>
@@ -2373,7 +2402,7 @@
       <w:pPr>
         <w:pStyle w:val="2"/>
       </w:pPr>
-      <w:bookmarkStart w:id="2" w:name="_Toc528749145"/>
+      <w:bookmarkStart w:id="2" w:name="_Toc214200081"/>
       <w:r>
         <w:t>Περιγραφή</w:t>
       </w:r>
@@ -2428,7 +2457,7 @@
       <w:pPr>
         <w:pStyle w:val="2"/>
       </w:pPr>
-      <w:bookmarkStart w:id="3" w:name="_Toc528749146"/>
+      <w:bookmarkStart w:id="3" w:name="_Toc214200082"/>
       <w:r>
         <w:t>Απαιτήσεις Εφαρμογής σε Δεδομένα</w:t>
       </w:r>
@@ -2446,24 +2475,61 @@
         <w:rPr>
           <w:rFonts w:asciiTheme="minorHAnsi" w:hAnsiTheme="minorHAnsi" w:cstheme="minorHAnsi"/>
         </w:rPr>
-        <w:t xml:space="preserve">Για τη συγκεκριμένη βάση δεδομένων, εκτιμάται ότι η εφαρμογή θα καταγράφει όλα τα στοιχεία που σχετίζονται με τα κατοικίδια ζώα και το πλήρες ιστορικό υγείας τους. Συνολικά, αναμένεται να υπάρχουν </w:t>
+        <w:t>Για τη συγκεκριμένη</w:t>
+      </w:r>
+      <w:r>
+        <w:rPr>
+          <w:rFonts w:asciiTheme="minorHAnsi" w:hAnsiTheme="minorHAnsi" w:cstheme="minorHAnsi"/>
+        </w:rPr>
+        <w:t xml:space="preserve"> βάση δεδομένων, εκτιμάται ότι η εφαρμογή θα καταγράφει όλα τα στοιχεία που σχετίζονται με τα κατοικίδια ζώα και το πλήρες ιστορικό υγείας τους. Συνολικά, αναμένεται να υπάρχουν </w:t>
       </w:r>
       <w:r>
         <w:rPr>
           <w:rStyle w:val="a5"/>
           <w:rFonts w:asciiTheme="minorHAnsi" w:eastAsiaTheme="majorEastAsia" w:hAnsiTheme="minorHAnsi" w:cstheme="minorHAnsi"/>
         </w:rPr>
-        <w:t>~2.500–3.000 ζώα</w:t>
+        <w:t>~2.000–3.5</w:t>
+      </w:r>
+      <w:r>
+        <w:rPr>
+          <w:rStyle w:val="a5"/>
+          <w:rFonts w:asciiTheme="minorHAnsi" w:eastAsiaTheme="majorEastAsia" w:hAnsiTheme="minorHAnsi" w:cstheme="minorHAnsi"/>
+        </w:rPr>
+        <w:t>00 ζώα</w:t>
       </w:r>
       <w:r>
         <w:rPr>
           <w:rFonts w:asciiTheme="minorHAnsi" w:hAnsiTheme="minorHAnsi" w:cstheme="minorHAnsi"/>
         </w:rPr>
-        <w:t xml:space="preserve"> καταχωρημένα στο σύστημα, με κάθε ζώο να διαθέτει μοναδικό </w:t>
+        <w:t xml:space="preserve"> καταχωρημένα στο σύστημα</w:t>
       </w:r>
       <w:r>
         <w:rPr>
           <w:rFonts w:asciiTheme="minorHAnsi" w:hAnsiTheme="minorHAnsi" w:cstheme="minorHAnsi"/>
+        </w:rPr>
+        <w:t>, με</w:t>
+      </w:r>
+      <w:r>
+        <w:rPr>
+          <w:rFonts w:asciiTheme="minorHAnsi" w:hAnsiTheme="minorHAnsi" w:cstheme="minorHAnsi"/>
+        </w:rPr>
+        <w:t xml:space="preserve"> κάθε ζώο </w:t>
+      </w:r>
+      <w:r>
+        <w:rPr>
+          <w:rFonts w:asciiTheme="minorHAnsi" w:hAnsiTheme="minorHAnsi" w:cstheme="minorHAnsi"/>
+        </w:rPr>
+        <w:t>να</w:t>
+      </w:r>
+      <w:r>
+        <w:rPr>
+          <w:rFonts w:asciiTheme="minorHAnsi" w:hAnsiTheme="minorHAnsi" w:cstheme="minorHAnsi"/>
+        </w:rPr>
+        <w:t xml:space="preserve"> διαθέτει μοναδικό </w:t>
+      </w:r>
+      <w:r>
+        <w:rPr>
+          <w:rFonts w:asciiTheme="minorHAnsi" w:hAnsiTheme="minorHAnsi" w:cstheme="minorHAnsi"/>
           <w:lang w:val="en-US"/>
         </w:rPr>
         <w:t>ID</w:t>
@@ -2539,6 +2605,22 @@
         <w:rPr>
           <w:rFonts w:asciiTheme="minorHAnsi" w:hAnsiTheme="minorHAnsi" w:cstheme="minorHAnsi"/>
         </w:rPr>
+        <w:t xml:space="preserve">, </w:t>
+      </w:r>
+      <w:r>
+        <w:rPr>
+          <w:rFonts w:asciiTheme="minorHAnsi" w:hAnsiTheme="minorHAnsi" w:cstheme="minorHAnsi"/>
+          <w:lang w:val="en-US"/>
+        </w:rPr>
+        <w:t>color</w:t>
+      </w:r>
+      <w:r>
+        <w:rPr>
+          <w:rFonts w:asciiTheme="minorHAnsi" w:hAnsiTheme="minorHAnsi" w:cstheme="minorHAnsi"/>
+        </w:rPr>
+        <w:t>,</w:t>
+      </w:r>
+      <w:r>
         <w:t xml:space="preserve"> </w:t>
       </w:r>
       <w:r>
@@ -2546,13 +2628,26 @@
           <w:rFonts w:asciiTheme="minorHAnsi" w:hAnsiTheme="minorHAnsi" w:cstheme="minorHAnsi"/>
           <w:lang w:val="en-US"/>
         </w:rPr>
-        <w:t>etc</w:t>
+        <w:t>distinguishing</w:t>
       </w:r>
       <w:r>
         <w:rPr>
           <w:rFonts w:asciiTheme="minorHAnsi" w:hAnsiTheme="minorHAnsi" w:cstheme="minorHAnsi"/>
         </w:rPr>
-        <w:t xml:space="preserve">.). </w:t>
+        <w:t xml:space="preserve"> </w:t>
+      </w:r>
+      <w:r>
+        <w:rPr>
+          <w:rFonts w:asciiTheme="minorHAnsi" w:hAnsiTheme="minorHAnsi" w:cstheme="minorHAnsi"/>
+          <w:lang w:val="en-US"/>
+        </w:rPr>
+        <w:t>marks</w:t>
+      </w:r>
+      <w:r>
+        <w:rPr>
+          <w:rFonts w:asciiTheme="minorHAnsi" w:hAnsiTheme="minorHAnsi" w:cstheme="minorHAnsi"/>
+        </w:rPr>
+        <w:t xml:space="preserve">). </w:t>
       </w:r>
     </w:p>
     <w:p>
@@ -2567,13 +2662,25 @@
         <w:rPr>
           <w:rFonts w:asciiTheme="minorHAnsi" w:hAnsiTheme="minorHAnsi" w:cstheme="minorHAnsi"/>
         </w:rPr>
-        <w:t xml:space="preserve">Σε επίπεδο </w:t>
+        <w:t>Παράλληλα</w:t>
       </w:r>
       <w:r>
         <w:rPr>
           <w:rFonts w:asciiTheme="minorHAnsi" w:hAnsiTheme="minorHAnsi" w:cstheme="minorHAnsi"/>
         </w:rPr>
-        <w:t xml:space="preserve">δεδομένων, υπολογίζεται ότι κάθε ζώο θα πραγματοποιεί κατά μέσο όρο </w:t>
+        <w:t xml:space="preserve">, </w:t>
+      </w:r>
+      <w:r>
+        <w:rPr>
+          <w:rFonts w:asciiTheme="minorHAnsi" w:hAnsiTheme="minorHAnsi" w:cstheme="minorHAnsi"/>
+        </w:rPr>
+        <w:t xml:space="preserve">με βάση πραγματικής έρευνας </w:t>
+      </w:r>
+      <w:r>
+        <w:rPr>
+          <w:rFonts w:asciiTheme="minorHAnsi" w:hAnsiTheme="minorHAnsi" w:cstheme="minorHAnsi"/>
+        </w:rPr>
+        <w:t xml:space="preserve">υπολογίζεται ότι κάθε ζώο θα πραγματοποιεί κατά μέσο όρο </w:t>
       </w:r>
       <w:r>
         <w:rPr>
@@ -2593,42 +2700,76 @@
           <w:rStyle w:val="a5"/>
           <w:rFonts w:asciiTheme="minorHAnsi" w:eastAsiaTheme="majorEastAsia" w:hAnsiTheme="minorHAnsi" w:cstheme="minorHAnsi"/>
         </w:rPr>
-        <w:t>~25.000 εγγραφές εμβολιασμών</w:t>
-      </w:r>
-      <w:r>
-        <w:rPr>
-          <w:rFonts w:asciiTheme="minorHAnsi" w:hAnsiTheme="minorHAnsi" w:cstheme="minorHAnsi"/>
-        </w:rPr>
-        <w:t xml:space="preserve">. Επιπλέον, αναμένεται να αποθηκευτούν </w:t>
+        <w:t>~</w:t>
       </w:r>
       <w:r>
         <w:rPr>
           <w:rStyle w:val="a5"/>
           <w:rFonts w:asciiTheme="minorHAnsi" w:eastAsiaTheme="majorEastAsia" w:hAnsiTheme="minorHAnsi" w:cstheme="minorHAnsi"/>
         </w:rPr>
-        <w:t>~30.000–45.000 εργαστηριακές εξετάσεις</w:t>
+        <w:t>2.500-3.500</w:t>
+      </w:r>
+      <w:r>
+        <w:rPr>
+          <w:rStyle w:val="a5"/>
+          <w:rFonts w:asciiTheme="minorHAnsi" w:eastAsiaTheme="majorEastAsia" w:hAnsiTheme="minorHAnsi" w:cstheme="minorHAnsi"/>
+        </w:rPr>
+        <w:t xml:space="preserve"> εγγραφές εμβολιασμών</w:t>
+      </w:r>
+      <w:r>
+        <w:rPr>
+          <w:rStyle w:val="a5"/>
+          <w:rFonts w:asciiTheme="minorHAnsi" w:eastAsiaTheme="majorEastAsia" w:hAnsiTheme="minorHAnsi" w:cstheme="minorHAnsi"/>
+        </w:rPr>
+        <w:t xml:space="preserve"> ανά έτος</w:t>
       </w:r>
       <w:r>
         <w:rPr>
           <w:rFonts w:asciiTheme="minorHAnsi" w:hAnsiTheme="minorHAnsi" w:cstheme="minorHAnsi"/>
         </w:rPr>
-        <w:t>, καθώς τα ζώα λα</w:t>
+        <w:t xml:space="preserve">. Επιπλέον, αναμένεται να αποθηκευτούν </w:t>
+      </w:r>
+      <w:r>
+        <w:rPr>
+          <w:rStyle w:val="a5"/>
+          <w:rFonts w:asciiTheme="minorHAnsi" w:eastAsiaTheme="majorEastAsia" w:hAnsiTheme="minorHAnsi" w:cstheme="minorHAnsi"/>
+        </w:rPr>
+        <w:t>~3.000–4</w:t>
+      </w:r>
+      <w:r>
+        <w:rPr>
+          <w:rStyle w:val="a5"/>
+          <w:rFonts w:asciiTheme="minorHAnsi" w:eastAsiaTheme="majorEastAsia" w:hAnsiTheme="minorHAnsi" w:cstheme="minorHAnsi"/>
+        </w:rPr>
+        <w:t>.000 εργαστηριακές εξετάσεις</w:t>
       </w:r>
       <w:r>
         <w:rPr>
           <w:rFonts w:asciiTheme="minorHAnsi" w:hAnsiTheme="minorHAnsi" w:cstheme="minorHAnsi"/>
         </w:rPr>
-        <w:t>μβάνουν συνήθως 2–5 διαγνωστικά</w:t>
+        <w:t xml:space="preserve">, καθώς τα ζώα </w:t>
       </w:r>
       <w:r>
         <w:rPr>
           <w:rFonts w:asciiTheme="minorHAnsi" w:hAnsiTheme="minorHAnsi" w:cstheme="minorHAnsi"/>
         </w:rPr>
+        <w:t>υποβάλλονται συνήθως 1–2</w:t>
+      </w:r>
+      <w:r>
+        <w:rPr>
+          <w:rFonts w:asciiTheme="minorHAnsi" w:hAnsiTheme="minorHAnsi" w:cstheme="minorHAnsi"/>
+        </w:rPr>
         <w:t xml:space="preserve"> </w:t>
       </w:r>
       <w:r>
         <w:rPr>
           <w:rFonts w:asciiTheme="minorHAnsi" w:hAnsiTheme="minorHAnsi" w:cstheme="minorHAnsi"/>
+        </w:rPr>
+        <w:t xml:space="preserve">σε διαγνωστικό </w:t>
+      </w:r>
+      <w:r>
+        <w:rPr>
+          <w:rFonts w:asciiTheme="minorHAnsi" w:hAnsiTheme="minorHAnsi" w:cstheme="minorHAnsi"/>
           <w:lang w:val="en-US"/>
         </w:rPr>
         <w:t>test</w:t>
@@ -2637,7 +2778,7 @@
         <w:rPr>
           <w:rFonts w:asciiTheme="minorHAnsi" w:hAnsiTheme="minorHAnsi" w:cstheme="minorHAnsi"/>
         </w:rPr>
-        <w:t xml:space="preserve"> ετησίως για περίοδο παρακολούθησης αρκετών ετών.</w:t>
+        <w:t xml:space="preserve"> ετησίως.</w:t>
       </w:r>
     </w:p>
     <w:p>
@@ -2671,33 +2812,114 @@
           <w:rStyle w:val="a5"/>
           <w:rFonts w:asciiTheme="minorHAnsi" w:eastAsiaTheme="majorEastAsia" w:hAnsiTheme="minorHAnsi" w:cstheme="minorHAnsi"/>
         </w:rPr>
-        <w:t>~20.000–35.000 αντιπαρασιτικές θεραπείες</w:t>
-      </w:r>
-      <w:r>
-        <w:rPr>
-          <w:rFonts w:asciiTheme="minorHAnsi" w:hAnsiTheme="minorHAnsi" w:cstheme="minorHAnsi"/>
-        </w:rPr>
-        <w:t xml:space="preserve">, καθώς και </w:t>
+        <w:t>~</w:t>
       </w:r>
       <w:r>
         <w:rPr>
           <w:rStyle w:val="a5"/>
           <w:rFonts w:asciiTheme="minorHAnsi" w:eastAsiaTheme="majorEastAsia" w:hAnsiTheme="minorHAnsi" w:cstheme="minorHAnsi"/>
         </w:rPr>
-        <w:t>~10.000–18.000 λοιπές θεραπείες</w:t>
-      </w:r>
-      <w:r>
-        <w:rPr>
-          <w:rFonts w:asciiTheme="minorHAnsi" w:hAnsiTheme="minorHAnsi" w:cstheme="minorHAnsi"/>
-        </w:rPr>
-        <w:t xml:space="preserve"> (φαρμακευτικές αγωγές, αντιβιώσεις). Οι χειρουργικές επεμβάσεις αναμένεται να είναι λιγότερες, της τάξης των </w:t>
+        <w:t>3</w:t>
       </w:r>
       <w:r>
         <w:rPr>
           <w:rStyle w:val="a5"/>
           <w:rFonts w:asciiTheme="minorHAnsi" w:eastAsiaTheme="majorEastAsia" w:hAnsiTheme="minorHAnsi" w:cstheme="minorHAnsi"/>
         </w:rPr>
-        <w:t>300–600 εγγραφών</w:t>
+        <w:t>.000–</w:t>
+      </w:r>
+      <w:r>
+        <w:rPr>
+          <w:rStyle w:val="a5"/>
+          <w:rFonts w:asciiTheme="minorHAnsi" w:eastAsiaTheme="majorEastAsia" w:hAnsiTheme="minorHAnsi" w:cstheme="minorHAnsi"/>
+        </w:rPr>
+        <w:t>4</w:t>
+      </w:r>
+      <w:r>
+        <w:rPr>
+          <w:rStyle w:val="a5"/>
+          <w:rFonts w:asciiTheme="minorHAnsi" w:eastAsiaTheme="majorEastAsia" w:hAnsiTheme="minorHAnsi" w:cstheme="minorHAnsi"/>
+        </w:rPr>
+        <w:t>.000 αντιπαρασιτικές θεραπείες</w:t>
+      </w:r>
+      <w:r>
+        <w:rPr>
+          <w:rFonts w:asciiTheme="minorHAnsi" w:hAnsiTheme="minorHAnsi" w:cstheme="minorHAnsi"/>
+        </w:rPr>
+        <w:t xml:space="preserve">, καθώς και </w:t>
+      </w:r>
+      <w:r>
+        <w:rPr>
+          <w:rStyle w:val="a5"/>
+          <w:rFonts w:asciiTheme="minorHAnsi" w:eastAsiaTheme="majorEastAsia" w:hAnsiTheme="minorHAnsi" w:cstheme="minorHAnsi"/>
+        </w:rPr>
+        <w:t>~</w:t>
+      </w:r>
+      <w:r>
+        <w:rPr>
+          <w:rStyle w:val="a5"/>
+          <w:rFonts w:asciiTheme="minorHAnsi" w:eastAsiaTheme="majorEastAsia" w:hAnsiTheme="minorHAnsi" w:cstheme="minorHAnsi"/>
+        </w:rPr>
+        <w:t>4</w:t>
+      </w:r>
+      <w:r>
+        <w:rPr>
+          <w:rStyle w:val="a5"/>
+          <w:rFonts w:asciiTheme="minorHAnsi" w:eastAsiaTheme="majorEastAsia" w:hAnsiTheme="minorHAnsi" w:cstheme="minorHAnsi"/>
+        </w:rPr>
+        <w:t>.000–</w:t>
+      </w:r>
+      <w:r>
+        <w:rPr>
+          <w:rStyle w:val="a5"/>
+          <w:rFonts w:asciiTheme="minorHAnsi" w:eastAsiaTheme="majorEastAsia" w:hAnsiTheme="minorHAnsi" w:cstheme="minorHAnsi"/>
+        </w:rPr>
+        <w:t>6</w:t>
+      </w:r>
+      <w:r>
+        <w:rPr>
+          <w:rStyle w:val="a5"/>
+          <w:rFonts w:asciiTheme="minorHAnsi" w:eastAsiaTheme="majorEastAsia" w:hAnsiTheme="minorHAnsi" w:cstheme="minorHAnsi"/>
+        </w:rPr>
+        <w:t>.000 λοιπές θεραπείες</w:t>
+      </w:r>
+      <w:r>
+        <w:rPr>
+          <w:rFonts w:asciiTheme="minorHAnsi" w:hAnsiTheme="minorHAnsi" w:cstheme="minorHAnsi"/>
+        </w:rPr>
+        <w:t xml:space="preserve"> (φαρμακευτικές αγωγές, αντιβιώσεις)</w:t>
+      </w:r>
+      <w:r>
+        <w:rPr>
+          <w:rFonts w:asciiTheme="minorHAnsi" w:hAnsiTheme="minorHAnsi" w:cstheme="minorHAnsi"/>
+        </w:rPr>
+        <w:t xml:space="preserve"> </w:t>
+      </w:r>
+      <w:r>
+        <w:rPr>
+          <w:rFonts w:asciiTheme="minorHAnsi" w:hAnsiTheme="minorHAnsi" w:cstheme="minorHAnsi"/>
+        </w:rPr>
+        <w:t>ανά έτος</w:t>
+      </w:r>
+      <w:r>
+        <w:rPr>
+          <w:rFonts w:asciiTheme="minorHAnsi" w:hAnsiTheme="minorHAnsi" w:cstheme="minorHAnsi"/>
+        </w:rPr>
+        <w:t xml:space="preserve">. Οι χειρουργικές επεμβάσεις αναμένεται να είναι λιγότερες, της τάξης των </w:t>
+      </w:r>
+      <w:r>
+        <w:rPr>
+          <w:rStyle w:val="a5"/>
+          <w:rFonts w:asciiTheme="minorHAnsi" w:eastAsiaTheme="majorEastAsia" w:hAnsiTheme="minorHAnsi" w:cstheme="minorHAnsi"/>
+        </w:rPr>
+        <w:t>200–4</w:t>
+      </w:r>
+      <w:r>
+        <w:rPr>
+          <w:rStyle w:val="a5"/>
+          <w:rFonts w:asciiTheme="minorHAnsi" w:eastAsiaTheme="majorEastAsia" w:hAnsiTheme="minorHAnsi" w:cstheme="minorHAnsi"/>
+        </w:rPr>
+        <w:t>00 εγγραφών</w:t>
       </w:r>
       <w:r>
         <w:rPr>
@@ -2718,33 +2940,53 @@
         <w:rPr>
           <w:rFonts w:asciiTheme="minorHAnsi" w:hAnsiTheme="minorHAnsi" w:cstheme="minorHAnsi"/>
         </w:rPr>
-        <w:t>Το σύστημα θα αποθηκεύει επίσης στοιχεία ιδιοκτητών (</w:t>
+        <w:t xml:space="preserve">Το σύστημα θα αποθηκεύει επίσης στοιχεία ιδιοκτητών </w:t>
       </w:r>
       <w:r>
         <w:rPr>
           <w:rStyle w:val="a5"/>
           <w:rFonts w:asciiTheme="minorHAnsi" w:eastAsiaTheme="majorEastAsia" w:hAnsiTheme="minorHAnsi" w:cstheme="minorHAnsi"/>
         </w:rPr>
-        <w:t>~2.000 εγγραφές</w:t>
-      </w:r>
-      <w:r>
-        <w:rPr>
-          <w:rFonts w:asciiTheme="minorHAnsi" w:hAnsiTheme="minorHAnsi" w:cstheme="minorHAnsi"/>
-        </w:rPr>
-        <w:t>) και κτηνιάτρων (</w:t>
+        <w:t>~</w:t>
       </w:r>
       <w:r>
         <w:rPr>
           <w:rStyle w:val="a5"/>
           <w:rFonts w:asciiTheme="minorHAnsi" w:eastAsiaTheme="majorEastAsia" w:hAnsiTheme="minorHAnsi" w:cstheme="minorHAnsi"/>
         </w:rPr>
+        <w:t>1.500-</w:t>
+      </w:r>
+      <w:r>
+        <w:rPr>
+          <w:rStyle w:val="a5"/>
+          <w:rFonts w:asciiTheme="minorHAnsi" w:eastAsiaTheme="majorEastAsia" w:hAnsiTheme="minorHAnsi" w:cstheme="minorHAnsi"/>
+        </w:rPr>
+        <w:t>2.000 εγγραφές</w:t>
+      </w:r>
+      <w:r>
+        <w:rPr>
+          <w:rFonts w:asciiTheme="minorHAnsi" w:hAnsiTheme="minorHAnsi" w:cstheme="minorHAnsi"/>
+        </w:rPr>
+        <w:t xml:space="preserve"> και κτηνιάτρων </w:t>
+      </w:r>
+      <w:r>
+        <w:rPr>
+          <w:rFonts w:asciiTheme="minorHAnsi" w:hAnsiTheme="minorHAnsi" w:cstheme="minorHAnsi"/>
+        </w:rPr>
+        <w:t>~</w:t>
+      </w:r>
+      <w:r>
+        <w:rPr>
+          <w:rStyle w:val="a5"/>
+          <w:rFonts w:asciiTheme="minorHAnsi" w:eastAsiaTheme="majorEastAsia" w:hAnsiTheme="minorHAnsi" w:cstheme="minorHAnsi"/>
+        </w:rPr>
         <w:t>5–10 εγγραφές</w:t>
       </w:r>
       <w:r>
         <w:rPr>
           <w:rFonts w:asciiTheme="minorHAnsi" w:hAnsiTheme="minorHAnsi" w:cstheme="minorHAnsi"/>
         </w:rPr>
-        <w:t xml:space="preserve">), ενώ λόγω </w:t>
+        <w:t xml:space="preserve">, ενώ λόγω </w:t>
       </w:r>
       <w:r>
         <w:rPr>
@@ -2776,6 +3018,10 @@
       <w:pPr>
         <w:pStyle w:val="Web"/>
         <w:jc w:val="both"/>
+        <w:rPr>
+          <w:rFonts w:ascii="Calibri" w:hAnsi="Calibri" w:cs="Calibri"/>
+          <w:lang w:val="en-US"/>
+        </w:rPr>
       </w:pPr>
       <w:r>
         <w:rPr>
@@ -2788,48 +3034,166 @@
           <w:rStyle w:val="a5"/>
           <w:rFonts w:asciiTheme="minorHAnsi" w:eastAsiaTheme="majorEastAsia" w:hAnsiTheme="minorHAnsi" w:cstheme="minorHAnsi"/>
         </w:rPr>
-        <w:t>~80.000–140.000 εγγραφές</w:t>
+        <w:t>~15</w:t>
+      </w:r>
+      <w:r>
+        <w:rPr>
+          <w:rStyle w:val="a5"/>
+          <w:rFonts w:asciiTheme="minorHAnsi" w:eastAsiaTheme="majorEastAsia" w:hAnsiTheme="minorHAnsi" w:cstheme="minorHAnsi"/>
+        </w:rPr>
+        <w:t>.000–</w:t>
+      </w:r>
+      <w:r>
+        <w:rPr>
+          <w:rStyle w:val="a5"/>
+          <w:rFonts w:asciiTheme="minorHAnsi" w:eastAsiaTheme="majorEastAsia" w:hAnsiTheme="minorHAnsi" w:cstheme="minorHAnsi"/>
+        </w:rPr>
+        <w:t>25</w:t>
+      </w:r>
+      <w:r>
+        <w:rPr>
+          <w:rStyle w:val="a5"/>
+          <w:rFonts w:asciiTheme="minorHAnsi" w:eastAsiaTheme="majorEastAsia" w:hAnsiTheme="minorHAnsi" w:cstheme="minorHAnsi"/>
+        </w:rPr>
+        <w:t>.000 εγγραφές</w:t>
       </w:r>
       <w:r>
         <w:rPr>
           <w:rFonts w:asciiTheme="minorHAnsi" w:hAnsiTheme="minorHAnsi" w:cstheme="minorHAnsi"/>
         </w:rPr>
-        <w:t xml:space="preserve"> σε όλους τους πίνακες. Το εκτιμώμενο μέγεθος αποθήκευσης</w:t>
+        <w:t xml:space="preserve"> </w:t>
+      </w:r>
+      <w:r>
+        <w:rPr>
+          <w:rFonts w:asciiTheme="minorHAnsi" w:hAnsiTheme="minorHAnsi" w:cstheme="minorHAnsi"/>
+        </w:rPr>
+        <w:t>ανά έτος</w:t>
+      </w:r>
+      <w:r>
+        <w:rPr>
+          <w:rFonts w:asciiTheme="minorHAnsi" w:hAnsiTheme="minorHAnsi" w:cstheme="minorHAnsi"/>
+        </w:rPr>
+        <w:t>. Το εκτιμώμενο μέγεθος αποθήκευσης</w:t>
       </w:r>
       <w:r>
         <w:t xml:space="preserve">, </w:t>
       </w:r>
       <w:r>
+        <w:rPr>
+          <w:rFonts w:ascii="Calibri" w:hAnsi="Calibri" w:cs="Calibri"/>
+        </w:rPr>
+        <w:t xml:space="preserve">υπολογίζεται στα </w:t>
+      </w:r>
+      <w:r>
+        <w:rPr>
+          <w:rStyle w:val="a5"/>
+          <w:rFonts w:ascii="Calibri" w:eastAsiaTheme="majorEastAsia" w:hAnsi="Calibri" w:cs="Calibri"/>
+        </w:rPr>
+        <w:t>0.5</w:t>
+      </w:r>
+      <w:r>
+        <w:rPr>
+          <w:rStyle w:val="a5"/>
+          <w:rFonts w:ascii="Calibri" w:eastAsiaTheme="majorEastAsia" w:hAnsi="Calibri" w:cs="Calibri"/>
+        </w:rPr>
+        <w:t>–</w:t>
+      </w:r>
+      <w:r>
+        <w:rPr>
+          <w:rStyle w:val="a5"/>
+          <w:rFonts w:ascii="Calibri" w:eastAsiaTheme="majorEastAsia" w:hAnsi="Calibri" w:cs="Calibri"/>
+        </w:rPr>
+        <w:t>1</w:t>
+      </w:r>
+      <w:r>
+        <w:rPr>
+          <w:rStyle w:val="a5"/>
+          <w:rFonts w:ascii="Calibri" w:eastAsiaTheme="majorEastAsia" w:hAnsi="Calibri" w:cs="Calibri"/>
+        </w:rPr>
+        <w:t xml:space="preserve"> </w:t>
+      </w:r>
+      <w:r>
+        <w:rPr>
+          <w:rStyle w:val="a5"/>
+          <w:rFonts w:ascii="Calibri" w:eastAsiaTheme="majorEastAsia" w:hAnsi="Calibri" w:cs="Calibri"/>
+          <w:lang w:val="en-US"/>
+        </w:rPr>
+        <w:t>G</w:t>
+      </w:r>
+      <w:r>
+        <w:rPr>
+          <w:rStyle w:val="a5"/>
+          <w:rFonts w:ascii="Calibri" w:eastAsiaTheme="majorEastAsia" w:hAnsi="Calibri" w:cs="Calibri"/>
+        </w:rPr>
+        <w:t>B</w:t>
+      </w:r>
+      <w:r>
+        <w:rPr>
+          <w:rFonts w:ascii="Calibri" w:hAnsi="Calibri" w:cs="Calibri"/>
+        </w:rPr>
+        <w:t xml:space="preserve">, με δυνατότητα επέκτασης έως </w:t>
+      </w:r>
+      <w:r>
+        <w:rPr>
+          <w:rStyle w:val="a5"/>
+          <w:rFonts w:ascii="Calibri" w:eastAsiaTheme="majorEastAsia" w:hAnsi="Calibri" w:cs="Calibri"/>
+        </w:rPr>
+        <w:t xml:space="preserve">1-2 </w:t>
+      </w:r>
+      <w:r>
+        <w:rPr>
+          <w:rStyle w:val="a5"/>
+          <w:rFonts w:ascii="Calibri" w:eastAsiaTheme="majorEastAsia" w:hAnsi="Calibri" w:cs="Calibri"/>
+          <w:lang w:val="en-US"/>
+        </w:rPr>
+        <w:t>GB</w:t>
+      </w:r>
+      <w:r>
+        <w:rPr>
+          <w:rFonts w:ascii="Calibri" w:hAnsi="Calibri" w:cs="Calibri"/>
+        </w:rPr>
+        <w:t xml:space="preserve"> για μελλοντική αύξηση των δεδομένων.</w:t>
+      </w:r>
+    </w:p>
+    <w:p>
+      <w:pPr>
+        <w:pStyle w:val="Web"/>
+        <w:jc w:val="both"/>
+        <w:rPr>
+          <w:rFonts w:asciiTheme="minorHAnsi" w:hAnsiTheme="minorHAnsi" w:cstheme="minorHAnsi"/>
+        </w:rPr>
+      </w:pPr>
+      <w:r>
+        <w:rPr>
+          <w:rFonts w:asciiTheme="minorHAnsi" w:hAnsiTheme="minorHAnsi" w:cstheme="minorHAnsi"/>
+        </w:rPr>
         <w:lastRenderedPageBreak/>
-        <w:t xml:space="preserve">υπολογίζεται στα </w:t>
-      </w:r>
-      <w:r>
-        <w:rPr>
-          <w:rStyle w:val="a5"/>
-          <w:rFonts w:eastAsiaTheme="majorEastAsia"/>
-        </w:rPr>
-        <w:t>150–250 MB</w:t>
-      </w:r>
-      <w:r>
-        <w:t xml:space="preserve">, με δυνατότητα επέκτασης έως </w:t>
-      </w:r>
-      <w:r>
-        <w:rPr>
-          <w:rStyle w:val="a5"/>
-          <w:rFonts w:eastAsiaTheme="majorEastAsia"/>
-        </w:rPr>
-        <w:t>~500 MB</w:t>
-      </w:r>
-      <w:r>
-        <w:t xml:space="preserve"> για μελλοντική αύξηση των δεδομένων.</w:t>
-      </w:r>
+        <w:t xml:space="preserve">Τα στοιχεία προέκυψαν από το </w:t>
+      </w:r>
+      <w:hyperlink r:id="rId6" w:history="1">
+        <w:r>
+          <w:rPr>
+            <w:rStyle w:val="-"/>
+            <w:rFonts w:asciiTheme="minorHAnsi" w:hAnsiTheme="minorHAnsi" w:cstheme="minorHAnsi"/>
+          </w:rPr>
+          <w:t>https://www</w:t>
+        </w:r>
+        <w:r>
+          <w:rPr>
+            <w:rStyle w:val="-"/>
+            <w:rFonts w:asciiTheme="minorHAnsi" w:hAnsiTheme="minorHAnsi" w:cstheme="minorHAnsi"/>
+          </w:rPr>
+          <w:t>.</w:t>
+        </w:r>
+        <w:r>
+          <w:rPr>
+            <w:rStyle w:val="-"/>
+            <w:rFonts w:asciiTheme="minorHAnsi" w:hAnsiTheme="minorHAnsi" w:cstheme="minorHAnsi"/>
+          </w:rPr>
+          <w:t>avma.org/resources-tools/reports-statistics</w:t>
+        </w:r>
+      </w:hyperlink>
     </w:p>
-    <w:p/>
-    <w:p/>
-    <w:p/>
-    <w:p/>
-    <w:p/>
-    <w:p/>
     <w:p>
       <w:pPr>
         <w:spacing w:after="0"/>
@@ -2843,17 +3207,13 @@
           <w:szCs w:val="32"/>
         </w:rPr>
       </w:pPr>
-      <w:r>
-        <w:br w:type="page"/>
-      </w:r>
     </w:p>
     <w:p>
       <w:pPr>
         <w:pStyle w:val="1"/>
       </w:pPr>
-      <w:bookmarkStart w:id="4" w:name="_Toc528749147"/>
-      <w:r>
-        <w:lastRenderedPageBreak/>
+      <w:bookmarkStart w:id="4" w:name="_Toc214200083"/>
+      <w:r>
         <w:t xml:space="preserve">Κατηγορίες </w:t>
       </w:r>
       <w:r>
@@ -2870,13 +3230,7 @@
       </w:r>
       <w:bookmarkEnd w:id="4"/>
     </w:p>
-    <w:p>
-      <w:pPr>
-        <w:rPr>
-          <w:lang w:val="en-US"/>
-        </w:rPr>
-      </w:pPr>
-    </w:p>
+    <w:p/>
     <w:p>
       <w:pPr>
         <w:rPr>
@@ -3311,7 +3665,7 @@
       <w:pPr>
         <w:pStyle w:val="1"/>
       </w:pPr>
-      <w:bookmarkStart w:id="5" w:name="_Toc528749148"/>
+      <w:bookmarkStart w:id="5" w:name="_Toc214200084"/>
       <w:r>
         <w:lastRenderedPageBreak/>
         <w:t>Μοντέλο Οντοτήτων/Συσχετίσεων</w:t>
@@ -3322,7 +3676,7 @@
       <w:pPr>
         <w:pStyle w:val="2"/>
       </w:pPr>
-      <w:bookmarkStart w:id="6" w:name="_Toc528749149"/>
+      <w:bookmarkStart w:id="6" w:name="_Toc214200085"/>
       <w:r>
         <w:t>Γενική Περιγραφή</w:t>
       </w:r>
@@ -3868,7 +4222,7 @@
       <w:pPr>
         <w:pStyle w:val="2"/>
       </w:pPr>
-      <w:bookmarkStart w:id="7" w:name="_Toc528749150"/>
+      <w:bookmarkStart w:id="7" w:name="_Toc214200086"/>
       <w:r>
         <w:t>Καθορισμός Οντοτήτων</w:t>
       </w:r>
@@ -4380,7 +4734,6 @@
         </w:numPr>
         <w:ind w:left="576"/>
       </w:pPr>
-      <w:bookmarkStart w:id="8" w:name="_Toc528749151"/>
     </w:p>
     <w:p>
       <w:pPr>
@@ -5386,14 +5739,21 @@
                 <w:lang w:val="en-US"/>
               </w:rPr>
             </w:pPr>
-            <w:proofErr w:type="spellStart"/>
-            <w:r>
-              <w:rPr>
-                <w:lang w:val="en-US"/>
-              </w:rPr>
-              <w:t>batchNo</w:t>
-            </w:r>
-            <w:proofErr w:type="spellEnd"/>
+            <w:r>
+              <w:rPr>
+                <w:lang w:val="en-US"/>
+              </w:rPr>
+              <w:t>batch</w:t>
+            </w:r>
+            <w:r>
+              <w:t xml:space="preserve"> </w:t>
+            </w:r>
+            <w:r>
+              <w:rPr>
+                <w:lang w:val="en-US"/>
+              </w:rPr>
+              <w:t>No</w:t>
+            </w:r>
           </w:p>
         </w:tc>
       </w:tr>
@@ -6510,6 +6870,709 @@
         </w:rPr>
       </w:pPr>
     </w:p>
+    <w:tbl>
+      <w:tblPr>
+        <w:tblStyle w:val="af1"/>
+        <w:tblW w:w="0" w:type="auto"/>
+        <w:tblLook w:val="04A0"/>
+      </w:tblPr>
+      <w:tblGrid>
+        <w:gridCol w:w="2376"/>
+        <w:gridCol w:w="6146"/>
+      </w:tblGrid>
+      <w:tr>
+        <w:tc>
+          <w:tcPr>
+            <w:tcW w:w="2376" w:type="dxa"/>
+            <w:shd w:val="clear" w:color="auto" w:fill="D9D9D9" w:themeFill="background1" w:themeFillShade="D9"/>
+          </w:tcPr>
+          <w:p>
+            <w:pPr>
+              <w:spacing w:after="0"/>
+              <w:rPr>
+                <w:b/>
+              </w:rPr>
+            </w:pPr>
+            <w:r>
+              <w:rPr>
+                <w:b/>
+              </w:rPr>
+              <w:t>Όνομα Οντότητας</w:t>
+            </w:r>
+          </w:p>
+        </w:tc>
+        <w:tc>
+          <w:tcPr>
+            <w:tcW w:w="6146" w:type="dxa"/>
+          </w:tcPr>
+          <w:p>
+            <w:pPr>
+              <w:spacing w:after="0"/>
+              <w:rPr>
+                <w:lang w:val="en-US"/>
+              </w:rPr>
+            </w:pPr>
+            <w:r>
+              <w:rPr>
+                <w:lang w:val="en-US"/>
+              </w:rPr>
+              <w:t>Other Treatments</w:t>
+            </w:r>
+          </w:p>
+        </w:tc>
+      </w:tr>
+      <w:tr>
+        <w:tc>
+          <w:tcPr>
+            <w:tcW w:w="2376" w:type="dxa"/>
+            <w:shd w:val="clear" w:color="auto" w:fill="D9D9D9" w:themeFill="background1" w:themeFillShade="D9"/>
+          </w:tcPr>
+          <w:p>
+            <w:pPr>
+              <w:spacing w:after="0"/>
+              <w:rPr>
+                <w:b/>
+              </w:rPr>
+            </w:pPr>
+            <w:r>
+              <w:rPr>
+                <w:b/>
+              </w:rPr>
+              <w:t>Περιγραφή</w:t>
+            </w:r>
+          </w:p>
+        </w:tc>
+        <w:tc>
+          <w:tcPr>
+            <w:tcW w:w="6146" w:type="dxa"/>
+          </w:tcPr>
+          <w:p>
+            <w:pPr>
+              <w:spacing w:after="0"/>
+            </w:pPr>
+            <w:r>
+              <w:t>Οντότητα που αποθηκεύονται οι θεραπείες που δεν ανήκουν στις άλλες κατηγορίες</w:t>
+            </w:r>
+          </w:p>
+        </w:tc>
+      </w:tr>
+      <w:tr>
+        <w:tc>
+          <w:tcPr>
+            <w:tcW w:w="2376" w:type="dxa"/>
+            <w:shd w:val="clear" w:color="auto" w:fill="D9D9D9" w:themeFill="background1" w:themeFillShade="D9"/>
+          </w:tcPr>
+          <w:p>
+            <w:pPr>
+              <w:spacing w:after="0"/>
+              <w:rPr>
+                <w:b/>
+              </w:rPr>
+            </w:pPr>
+            <w:r>
+              <w:rPr>
+                <w:b/>
+              </w:rPr>
+              <w:t>Ιδιότητες</w:t>
+            </w:r>
+          </w:p>
+        </w:tc>
+        <w:tc>
+          <w:tcPr>
+            <w:tcW w:w="6146" w:type="dxa"/>
+          </w:tcPr>
+          <w:p>
+            <w:pPr>
+              <w:spacing w:after="0"/>
+            </w:pPr>
+            <w:r>
+              <w:t>Ασθενής Οντότητα</w:t>
+            </w:r>
+          </w:p>
+        </w:tc>
+      </w:tr>
+      <w:tr>
+        <w:tc>
+          <w:tcPr>
+            <w:tcW w:w="2376" w:type="dxa"/>
+            <w:vMerge w:val="restart"/>
+            <w:shd w:val="clear" w:color="auto" w:fill="D9D9D9" w:themeFill="background1" w:themeFillShade="D9"/>
+          </w:tcPr>
+          <w:p>
+            <w:pPr>
+              <w:spacing w:after="0"/>
+              <w:rPr>
+                <w:b/>
+              </w:rPr>
+            </w:pPr>
+          </w:p>
+          <w:p>
+            <w:pPr>
+              <w:spacing w:after="0"/>
+              <w:rPr>
+                <w:b/>
+              </w:rPr>
+            </w:pPr>
+            <w:r>
+              <w:rPr>
+                <w:b/>
+              </w:rPr>
+              <w:t>Γνωρίσματα</w:t>
+            </w:r>
+          </w:p>
+        </w:tc>
+        <w:tc>
+          <w:tcPr>
+            <w:tcW w:w="6146" w:type="dxa"/>
+          </w:tcPr>
+          <w:p>
+            <w:pPr>
+              <w:spacing w:after="0"/>
+              <w:rPr>
+                <w:u w:val="single"/>
+                <w:lang w:val="en-US"/>
+              </w:rPr>
+            </w:pPr>
+            <w:r>
+              <w:rPr>
+                <w:u w:val="single"/>
+                <w:lang w:val="en-US"/>
+              </w:rPr>
+              <w:t>substance</w:t>
+            </w:r>
+          </w:p>
+        </w:tc>
+      </w:tr>
+      <w:tr>
+        <w:tc>
+          <w:tcPr>
+            <w:tcW w:w="2376" w:type="dxa"/>
+            <w:vMerge/>
+            <w:shd w:val="clear" w:color="auto" w:fill="D9D9D9" w:themeFill="background1" w:themeFillShade="D9"/>
+          </w:tcPr>
+          <w:p>
+            <w:pPr>
+              <w:spacing w:after="0"/>
+            </w:pPr>
+          </w:p>
+        </w:tc>
+        <w:tc>
+          <w:tcPr>
+            <w:tcW w:w="6146" w:type="dxa"/>
+          </w:tcPr>
+          <w:p>
+            <w:pPr>
+              <w:spacing w:after="0"/>
+              <w:rPr>
+                <w:u w:val="single"/>
+                <w:lang w:val="en-US"/>
+              </w:rPr>
+            </w:pPr>
+            <w:r>
+              <w:rPr>
+                <w:u w:val="single"/>
+                <w:lang w:val="en-US"/>
+              </w:rPr>
+              <w:t>start date</w:t>
+            </w:r>
+          </w:p>
+        </w:tc>
+      </w:tr>
+      <w:tr>
+        <w:tc>
+          <w:tcPr>
+            <w:tcW w:w="2376" w:type="dxa"/>
+            <w:vMerge/>
+            <w:shd w:val="clear" w:color="auto" w:fill="D9D9D9" w:themeFill="background1" w:themeFillShade="D9"/>
+          </w:tcPr>
+          <w:p>
+            <w:pPr>
+              <w:spacing w:after="0"/>
+            </w:pPr>
+          </w:p>
+        </w:tc>
+        <w:tc>
+          <w:tcPr>
+            <w:tcW w:w="6146" w:type="dxa"/>
+          </w:tcPr>
+          <w:p>
+            <w:pPr>
+              <w:spacing w:after="0"/>
+              <w:rPr>
+                <w:lang w:val="en-US"/>
+              </w:rPr>
+            </w:pPr>
+            <w:r>
+              <w:rPr>
+                <w:lang w:val="en-US"/>
+              </w:rPr>
+              <w:t>end date</w:t>
+            </w:r>
+          </w:p>
+        </w:tc>
+      </w:tr>
+      <w:tr>
+        <w:tc>
+          <w:tcPr>
+            <w:tcW w:w="2376" w:type="dxa"/>
+            <w:vMerge/>
+            <w:tcBorders>
+              <w:bottom w:val="nil"/>
+            </w:tcBorders>
+            <w:shd w:val="clear" w:color="auto" w:fill="D9D9D9" w:themeFill="background1" w:themeFillShade="D9"/>
+          </w:tcPr>
+          <w:p>
+            <w:pPr>
+              <w:spacing w:after="0"/>
+            </w:pPr>
+          </w:p>
+        </w:tc>
+        <w:tc>
+          <w:tcPr>
+            <w:tcW w:w="6146" w:type="dxa"/>
+          </w:tcPr>
+          <w:p>
+            <w:pPr>
+              <w:spacing w:after="0"/>
+              <w:rPr>
+                <w:lang w:val="en-US"/>
+              </w:rPr>
+            </w:pPr>
+            <w:r>
+              <w:rPr>
+                <w:lang w:val="en-US"/>
+              </w:rPr>
+              <w:t>disease</w:t>
+            </w:r>
+          </w:p>
+        </w:tc>
+      </w:tr>
+      <w:tr>
+        <w:tc>
+          <w:tcPr>
+            <w:tcW w:w="2376" w:type="dxa"/>
+            <w:tcBorders>
+              <w:top w:val="nil"/>
+              <w:bottom w:val="nil"/>
+            </w:tcBorders>
+            <w:shd w:val="clear" w:color="auto" w:fill="D9D9D9" w:themeFill="background1" w:themeFillShade="D9"/>
+          </w:tcPr>
+          <w:p>
+            <w:pPr>
+              <w:spacing w:after="0"/>
+            </w:pPr>
+          </w:p>
+        </w:tc>
+        <w:tc>
+          <w:tcPr>
+            <w:tcW w:w="6146" w:type="dxa"/>
+          </w:tcPr>
+          <w:p>
+            <w:pPr>
+              <w:spacing w:after="0"/>
+              <w:rPr>
+                <w:lang w:val="en-US"/>
+              </w:rPr>
+            </w:pPr>
+            <w:r>
+              <w:rPr>
+                <w:lang w:val="en-US"/>
+              </w:rPr>
+              <w:t>daily dosage</w:t>
+            </w:r>
+          </w:p>
+        </w:tc>
+      </w:tr>
+      <w:tr>
+        <w:tc>
+          <w:tcPr>
+            <w:tcW w:w="2376" w:type="dxa"/>
+            <w:tcBorders>
+              <w:top w:val="nil"/>
+            </w:tcBorders>
+            <w:shd w:val="clear" w:color="auto" w:fill="D9D9D9" w:themeFill="background1" w:themeFillShade="D9"/>
+          </w:tcPr>
+          <w:p>
+            <w:pPr>
+              <w:spacing w:after="0"/>
+            </w:pPr>
+          </w:p>
+        </w:tc>
+        <w:tc>
+          <w:tcPr>
+            <w:tcW w:w="6146" w:type="dxa"/>
+          </w:tcPr>
+          <w:p>
+            <w:pPr>
+              <w:spacing w:after="0"/>
+              <w:rPr>
+                <w:lang w:val="en-US"/>
+              </w:rPr>
+            </w:pPr>
+            <w:r>
+              <w:rPr>
+                <w:lang w:val="en-US"/>
+              </w:rPr>
+              <w:t>vet signature</w:t>
+            </w:r>
+          </w:p>
+        </w:tc>
+      </w:tr>
+    </w:tbl>
+    <w:p>
+      <w:pPr>
+        <w:pStyle w:val="2"/>
+        <w:numPr>
+          <w:ilvl w:val="0"/>
+          <w:numId w:val="0"/>
+        </w:numPr>
+        <w:rPr>
+          <w:lang w:val="en-US"/>
+        </w:rPr>
+      </w:pPr>
+    </w:p>
+    <w:p>
+      <w:pPr>
+        <w:pStyle w:val="2"/>
+      </w:pPr>
+      <w:bookmarkStart w:id="8" w:name="_Toc214200087"/>
+      <w:r>
+        <w:t>Καθορισμός Συσχετίσεων</w:t>
+      </w:r>
+      <w:bookmarkEnd w:id="8"/>
+    </w:p>
+    <w:p/>
+    <w:tbl>
+      <w:tblPr>
+        <w:tblStyle w:val="af1"/>
+        <w:tblW w:w="0" w:type="auto"/>
+        <w:tblLook w:val="04A0"/>
+      </w:tblPr>
+      <w:tblGrid>
+        <w:gridCol w:w="2376"/>
+        <w:gridCol w:w="6146"/>
+      </w:tblGrid>
+      <w:tr>
+        <w:tc>
+          <w:tcPr>
+            <w:tcW w:w="2376" w:type="dxa"/>
+            <w:shd w:val="clear" w:color="auto" w:fill="C6D9F1" w:themeFill="text2" w:themeFillTint="33"/>
+          </w:tcPr>
+          <w:p>
+            <w:pPr>
+              <w:spacing w:after="0"/>
+              <w:rPr>
+                <w:b/>
+              </w:rPr>
+            </w:pPr>
+            <w:r>
+              <w:rPr>
+                <w:b/>
+              </w:rPr>
+              <w:t xml:space="preserve">Όνομα </w:t>
+            </w:r>
+            <w:r>
+              <w:rPr>
+                <w:b/>
+              </w:rPr>
+              <w:t>Συσχέτισης</w:t>
+            </w:r>
+          </w:p>
+        </w:tc>
+        <w:tc>
+          <w:tcPr>
+            <w:tcW w:w="6146" w:type="dxa"/>
+          </w:tcPr>
+          <w:p>
+            <w:pPr>
+              <w:spacing w:after="0"/>
+              <w:rPr>
+                <w:lang w:val="en-US"/>
+              </w:rPr>
+            </w:pPr>
+            <w:proofErr w:type="spellStart"/>
+            <w:r>
+              <w:rPr>
+                <w:lang w:val="en-US"/>
+              </w:rPr>
+              <w:t>Owner_Has_Animal</w:t>
+            </w:r>
+            <w:proofErr w:type="spellEnd"/>
+            <w:r>
+              <w:rPr>
+                <w:lang w:val="en-US"/>
+              </w:rPr>
+              <w:t xml:space="preserve">  (Animal Owner – Animal)</w:t>
+            </w:r>
+          </w:p>
+        </w:tc>
+      </w:tr>
+      <w:tr>
+        <w:tc>
+          <w:tcPr>
+            <w:tcW w:w="2376" w:type="dxa"/>
+            <w:shd w:val="clear" w:color="auto" w:fill="C6D9F1" w:themeFill="text2" w:themeFillTint="33"/>
+          </w:tcPr>
+          <w:p>
+            <w:pPr>
+              <w:spacing w:after="0"/>
+              <w:rPr>
+                <w:b/>
+              </w:rPr>
+            </w:pPr>
+            <w:r>
+              <w:rPr>
+                <w:b/>
+              </w:rPr>
+              <w:t>Περιγραφή</w:t>
+            </w:r>
+          </w:p>
+        </w:tc>
+        <w:tc>
+          <w:tcPr>
+            <w:tcW w:w="6146" w:type="dxa"/>
+          </w:tcPr>
+          <w:p>
+            <w:pPr>
+              <w:spacing w:after="0"/>
+            </w:pPr>
+            <w:r>
+              <w:t xml:space="preserve">Κάθε </w:t>
+            </w:r>
+            <w:r>
+              <w:t>ιδιοκτήτης πρέπει να έχει ένα ή περισσότερα ζώα. Κάθε ζώο ανήκει σε έναν ιδιοκτήτη.</w:t>
+            </w:r>
+          </w:p>
+        </w:tc>
+      </w:tr>
+      <w:tr>
+        <w:tc>
+          <w:tcPr>
+            <w:tcW w:w="2376" w:type="dxa"/>
+            <w:shd w:val="clear" w:color="auto" w:fill="C6D9F1" w:themeFill="text2" w:themeFillTint="33"/>
+          </w:tcPr>
+          <w:p>
+            <w:pPr>
+              <w:spacing w:after="0"/>
+              <w:rPr>
+                <w:b/>
+              </w:rPr>
+            </w:pPr>
+            <w:r>
+              <w:rPr>
+                <w:b/>
+              </w:rPr>
+              <w:t>Ιδιότητες</w:t>
+            </w:r>
+          </w:p>
+        </w:tc>
+        <w:tc>
+          <w:tcPr>
+            <w:tcW w:w="6146" w:type="dxa"/>
+          </w:tcPr>
+          <w:p>
+            <w:pPr>
+              <w:spacing w:after="0"/>
+            </w:pPr>
+            <w:r>
+              <w:rPr>
+                <w:lang w:val="en-US"/>
+              </w:rPr>
+              <w:t>Has</w:t>
+            </w:r>
+            <w:r>
+              <w:t>-</w:t>
+            </w:r>
+            <w:r>
+              <w:rPr>
+                <w:lang w:val="en-US"/>
+              </w:rPr>
+              <w:t>A</w:t>
+            </w:r>
+            <w:r>
+              <w:t xml:space="preserve"> { Αναδρομική, Προσδιορίζουσα}</w:t>
+            </w:r>
+          </w:p>
+        </w:tc>
+      </w:tr>
+      <w:tr>
+        <w:tc>
+          <w:tcPr>
+            <w:tcW w:w="2376" w:type="dxa"/>
+            <w:shd w:val="clear" w:color="auto" w:fill="C6D9F1" w:themeFill="text2" w:themeFillTint="33"/>
+          </w:tcPr>
+          <w:p>
+            <w:pPr>
+              <w:spacing w:after="0"/>
+              <w:rPr>
+                <w:b/>
+              </w:rPr>
+            </w:pPr>
+            <w:r>
+              <w:rPr>
+                <w:b/>
+              </w:rPr>
+              <w:t xml:space="preserve">Λόγος </w:t>
+            </w:r>
+            <w:proofErr w:type="spellStart"/>
+            <w:r>
+              <w:rPr>
+                <w:b/>
+              </w:rPr>
+              <w:t>πληθικότητας</w:t>
+            </w:r>
+            <w:proofErr w:type="spellEnd"/>
+          </w:p>
+        </w:tc>
+        <w:tc>
+          <w:tcPr>
+            <w:tcW w:w="6146" w:type="dxa"/>
+          </w:tcPr>
+          <w:p>
+            <w:pPr>
+              <w:spacing w:after="0"/>
+            </w:pPr>
+            <w:r>
+              <w:t>1:</w:t>
+            </w:r>
+            <w:r>
+              <w:t>Ν</w:t>
+            </w:r>
+          </w:p>
+        </w:tc>
+      </w:tr>
+      <w:tr>
+        <w:tc>
+          <w:tcPr>
+            <w:tcW w:w="2376" w:type="dxa"/>
+            <w:vMerge w:val="restart"/>
+            <w:shd w:val="clear" w:color="auto" w:fill="C6D9F1" w:themeFill="text2" w:themeFillTint="33"/>
+          </w:tcPr>
+          <w:p>
+            <w:pPr>
+              <w:tabs>
+                <w:tab w:val="right" w:pos="2160"/>
+              </w:tabs>
+              <w:spacing w:after="0"/>
+              <w:rPr>
+                <w:b/>
+              </w:rPr>
+            </w:pPr>
+            <w:r>
+              <w:rPr>
+                <w:b/>
+              </w:rPr>
+              <w:t>Συμμετοχή</w:t>
+            </w:r>
+          </w:p>
+        </w:tc>
+        <w:tc>
+          <w:tcPr>
+            <w:tcW w:w="6146" w:type="dxa"/>
+          </w:tcPr>
+          <w:p>
+            <w:pPr>
+              <w:spacing w:after="0"/>
+              <w:rPr>
+                <w:lang w:val="en-US"/>
+              </w:rPr>
+            </w:pPr>
+            <w:r>
+              <w:t>Ολική</w:t>
+            </w:r>
+            <w:r>
+              <w:t xml:space="preserve"> Συμμετοχή του </w:t>
+            </w:r>
+            <w:r>
+              <w:rPr>
+                <w:lang w:val="en-US"/>
+              </w:rPr>
+              <w:t>Animal</w:t>
+            </w:r>
+          </w:p>
+        </w:tc>
+      </w:tr>
+      <w:tr>
+        <w:tc>
+          <w:tcPr>
+            <w:tcW w:w="2376" w:type="dxa"/>
+            <w:vMerge/>
+            <w:shd w:val="clear" w:color="auto" w:fill="C6D9F1" w:themeFill="text2" w:themeFillTint="33"/>
+          </w:tcPr>
+          <w:p>
+            <w:pPr>
+              <w:spacing w:after="0"/>
+              <w:rPr>
+                <w:b/>
+              </w:rPr>
+            </w:pPr>
+          </w:p>
+        </w:tc>
+        <w:tc>
+          <w:tcPr>
+            <w:tcW w:w="6146" w:type="dxa"/>
+          </w:tcPr>
+          <w:p>
+            <w:pPr>
+              <w:spacing w:after="0"/>
+            </w:pPr>
+            <w:r>
+              <w:t xml:space="preserve">Μερική </w:t>
+            </w:r>
+            <w:r>
+              <w:t xml:space="preserve">Συμμετοχή του </w:t>
+            </w:r>
+            <w:r>
+              <w:rPr>
+                <w:lang w:val="en-US"/>
+              </w:rPr>
+              <w:t>Animal</w:t>
+            </w:r>
+            <w:r>
+              <w:t xml:space="preserve"> </w:t>
+            </w:r>
+            <w:r>
+              <w:rPr>
+                <w:lang w:val="en-US"/>
+              </w:rPr>
+              <w:t>Owner</w:t>
+            </w:r>
+          </w:p>
+        </w:tc>
+      </w:tr>
+      <w:tr>
+        <w:tc>
+          <w:tcPr>
+            <w:tcW w:w="2376" w:type="dxa"/>
+            <w:shd w:val="clear" w:color="auto" w:fill="C6D9F1" w:themeFill="text2" w:themeFillTint="33"/>
+          </w:tcPr>
+          <w:p>
+            <w:pPr>
+              <w:spacing w:after="0"/>
+            </w:pPr>
+            <w:r>
+              <w:rPr>
+                <w:b/>
+              </w:rPr>
+              <w:t>Γνωρίσματα</w:t>
+            </w:r>
+          </w:p>
+        </w:tc>
+        <w:tc>
+          <w:tcPr>
+            <w:tcW w:w="6146" w:type="dxa"/>
+          </w:tcPr>
+          <w:p>
+            <w:pPr>
+              <w:spacing w:after="0"/>
+            </w:pPr>
+            <w:r>
+              <w:t>-</w:t>
+            </w:r>
+          </w:p>
+        </w:tc>
+      </w:tr>
+    </w:tbl>
     <w:p>
       <w:pPr>
         <w:rPr>
@@ -6531,20 +7594,26 @@
         <w:tc>
           <w:tcPr>
             <w:tcW w:w="2376" w:type="dxa"/>
-            <w:shd w:val="clear" w:color="auto" w:fill="D9D9D9" w:themeFill="background1" w:themeFillShade="D9"/>
-          </w:tcPr>
-          <w:p>
-            <w:pPr>
-              <w:spacing w:after="0"/>
-              <w:rPr>
-                <w:b/>
-              </w:rPr>
-            </w:pPr>
-            <w:r>
-              <w:rPr>
-                <w:b/>
-              </w:rPr>
-              <w:t>Όνομα Οντότητας</w:t>
+            <w:shd w:val="clear" w:color="auto" w:fill="C6D9F1" w:themeFill="text2" w:themeFillTint="33"/>
+          </w:tcPr>
+          <w:p>
+            <w:pPr>
+              <w:spacing w:after="0"/>
+              <w:rPr>
+                <w:b/>
+              </w:rPr>
+            </w:pPr>
+            <w:r>
+              <w:rPr>
+                <w:b/>
+              </w:rPr>
+              <w:t xml:space="preserve">Όνομα </w:t>
+            </w:r>
+            <w:r>
+              <w:rPr>
+                <w:b/>
+              </w:rPr>
+              <w:t>Συσχέτισης</w:t>
             </w:r>
           </w:p>
         </w:tc>
@@ -6563,7 +7632,13 @@
               <w:rPr>
                 <w:lang w:val="en-US"/>
               </w:rPr>
-              <w:t>Other Treatments</w:t>
+              <w:t>Animal is under care of Veterinarian</w:t>
+            </w:r>
+            <w:r>
+              <w:rPr>
+                <w:lang w:val="en-US"/>
+              </w:rPr>
+              <w:t xml:space="preserve"> </w:t>
             </w:r>
           </w:p>
         </w:tc>
@@ -6572,7 +7647,7 @@
         <w:tc>
           <w:tcPr>
             <w:tcW w:w="2376" w:type="dxa"/>
-            <w:shd w:val="clear" w:color="auto" w:fill="D9D9D9" w:themeFill="background1" w:themeFillShade="D9"/>
+            <w:shd w:val="clear" w:color="auto" w:fill="C6D9F1" w:themeFill="text2" w:themeFillTint="33"/>
           </w:tcPr>
           <w:p>
             <w:pPr>
@@ -6598,7 +7673,24 @@
               <w:spacing w:after="0"/>
             </w:pPr>
             <w:r>
-              <w:t>Οντότητα που αποθηκεύονται οι θεραπείες που δεν ανήκουν στις άλλες κατηγορίες</w:t>
+              <w:t xml:space="preserve">Κάθε ζώο παρακολουθείται από έναν ή </w:t>
+            </w:r>
+            <w:proofErr w:type="spellStart"/>
+            <w:r>
+              <w:t>περισσόετερους</w:t>
+            </w:r>
+            <w:proofErr w:type="spellEnd"/>
+            <w:r>
+              <w:t xml:space="preserve"> κτηνιάτρους</w:t>
+            </w:r>
+            <w:r>
+              <w:t xml:space="preserve">. Κάθε </w:t>
+            </w:r>
+            <w:r>
+              <w:t>κτηνίατρος έχει υπό την φροντίδα του πολλά ζώα</w:t>
+            </w:r>
+            <w:r>
+              <w:t>.</w:t>
             </w:r>
           </w:p>
         </w:tc>
@@ -6607,7 +7699,7 @@
         <w:tc>
           <w:tcPr>
             <w:tcW w:w="2376" w:type="dxa"/>
-            <w:shd w:val="clear" w:color="auto" w:fill="D9D9D9" w:themeFill="background1" w:themeFillShade="D9"/>
+            <w:shd w:val="clear" w:color="auto" w:fill="C6D9F1" w:themeFill="text2" w:themeFillTint="33"/>
           </w:tcPr>
           <w:p>
             <w:pPr>
@@ -6633,7 +7725,22 @@
               <w:spacing w:after="0"/>
             </w:pPr>
             <w:r>
-              <w:t>Ασθενής Οντότητα</w:t>
+              <w:rPr>
+                <w:lang w:val="en-US"/>
+              </w:rPr>
+              <w:t>Has</w:t>
+            </w:r>
+            <w:r>
+              <w:t>-</w:t>
+            </w:r>
+            <w:r>
+              <w:rPr>
+                <w:lang w:val="en-US"/>
+              </w:rPr>
+              <w:t>A</w:t>
+            </w:r>
+            <w:r>
+              <w:t xml:space="preserve"> { Αναδρομική, Προσδιορίζουσα}</w:t>
             </w:r>
           </w:p>
         </w:tc>
@@ -6642,30 +7749,29 @@
         <w:tc>
           <w:tcPr>
             <w:tcW w:w="2376" w:type="dxa"/>
-            <w:vMerge w:val="restart"/>
-            <w:shd w:val="clear" w:color="auto" w:fill="D9D9D9" w:themeFill="background1" w:themeFillShade="D9"/>
-          </w:tcPr>
-          <w:p>
-            <w:pPr>
-              <w:spacing w:after="0"/>
-              <w:rPr>
-                <w:b/>
-              </w:rPr>
-            </w:pPr>
-          </w:p>
-          <w:p>
-            <w:pPr>
-              <w:spacing w:after="0"/>
-              <w:rPr>
-                <w:b/>
-              </w:rPr>
-            </w:pPr>
-            <w:r>
-              <w:rPr>
-                <w:b/>
-              </w:rPr>
-              <w:t>Γνωρίσματα</w:t>
-            </w:r>
+            <w:shd w:val="clear" w:color="auto" w:fill="C6D9F1" w:themeFill="text2" w:themeFillTint="33"/>
+          </w:tcPr>
+          <w:p>
+            <w:pPr>
+              <w:spacing w:after="0"/>
+              <w:rPr>
+                <w:b/>
+              </w:rPr>
+            </w:pPr>
+            <w:r>
+              <w:rPr>
+                <w:b/>
+              </w:rPr>
+              <w:t xml:space="preserve">Λόγος </w:t>
+            </w:r>
+            <w:proofErr w:type="spellStart"/>
+            <w:r>
+              <w:rPr>
+                <w:b/>
+              </w:rPr>
+              <w:t>πληθικότητας</w:t>
+            </w:r>
+            <w:proofErr w:type="spellEnd"/>
           </w:p>
         </w:tc>
         <w:tc>
@@ -6676,16 +7782,14 @@
             <w:pPr>
               <w:spacing w:after="0"/>
               <w:rPr>
-                <w:u w:val="single"/>
-                <w:lang w:val="en-US"/>
-              </w:rPr>
-            </w:pPr>
-            <w:r>
-              <w:rPr>
-                <w:u w:val="single"/>
-                <w:lang w:val="en-US"/>
-              </w:rPr>
-              <w:t>substance</w:t>
+                <w:lang w:val="en-US"/>
+              </w:rPr>
+            </w:pPr>
+            <w:r>
+              <w:rPr>
+                <w:lang w:val="en-US"/>
+              </w:rPr>
+              <w:t>N:M</w:t>
             </w:r>
           </w:p>
         </w:tc>
@@ -6694,13 +7798,25 @@
         <w:tc>
           <w:tcPr>
             <w:tcW w:w="2376" w:type="dxa"/>
-            <w:vMerge/>
-            <w:shd w:val="clear" w:color="auto" w:fill="D9D9D9" w:themeFill="background1" w:themeFillShade="D9"/>
-          </w:tcPr>
-          <w:p>
-            <w:pPr>
-              <w:spacing w:after="0"/>
-            </w:pPr>
+            <w:vMerge w:val="restart"/>
+            <w:shd w:val="clear" w:color="auto" w:fill="C6D9F1" w:themeFill="text2" w:themeFillTint="33"/>
+          </w:tcPr>
+          <w:p>
+            <w:pPr>
+              <w:tabs>
+                <w:tab w:val="right" w:pos="2160"/>
+              </w:tabs>
+              <w:spacing w:after="0"/>
+              <w:rPr>
+                <w:b/>
+              </w:rPr>
+            </w:pPr>
+            <w:r>
+              <w:rPr>
+                <w:b/>
+              </w:rPr>
+              <w:t>Συμμετοχή</w:t>
+            </w:r>
           </w:p>
         </w:tc>
         <w:tc>
@@ -6711,16 +7827,17 @@
             <w:pPr>
               <w:spacing w:after="0"/>
               <w:rPr>
-                <w:u w:val="single"/>
-                <w:lang w:val="en-US"/>
-              </w:rPr>
-            </w:pPr>
-            <w:r>
-              <w:rPr>
-                <w:u w:val="single"/>
-                <w:lang w:val="en-US"/>
-              </w:rPr>
-              <w:t>start date</w:t>
+                <w:lang w:val="en-US"/>
+              </w:rPr>
+            </w:pPr>
+            <w:r>
+              <w:t xml:space="preserve">Ολική Συμμετοχή του </w:t>
+            </w:r>
+            <w:r>
+              <w:rPr>
+                <w:lang w:val="en-US"/>
+              </w:rPr>
+              <w:t>Animal</w:t>
             </w:r>
           </w:p>
         </w:tc>
@@ -6730,11 +7847,14 @@
           <w:tcPr>
             <w:tcW w:w="2376" w:type="dxa"/>
             <w:vMerge/>
-            <w:shd w:val="clear" w:color="auto" w:fill="D9D9D9" w:themeFill="background1" w:themeFillShade="D9"/>
-          </w:tcPr>
-          <w:p>
-            <w:pPr>
-              <w:spacing w:after="0"/>
+            <w:shd w:val="clear" w:color="auto" w:fill="C6D9F1" w:themeFill="text2" w:themeFillTint="33"/>
+          </w:tcPr>
+          <w:p>
+            <w:pPr>
+              <w:spacing w:after="0"/>
+              <w:rPr>
+                <w:b/>
+              </w:rPr>
             </w:pPr>
           </w:p>
         </w:tc>
@@ -6745,15 +7865,21 @@
           <w:p>
             <w:pPr>
               <w:spacing w:after="0"/>
-              <w:rPr>
-                <w:lang w:val="en-US"/>
-              </w:rPr>
-            </w:pPr>
-            <w:r>
-              <w:rPr>
-                <w:lang w:val="en-US"/>
-              </w:rPr>
-              <w:t>end date</w:t>
+            </w:pPr>
+            <w:r>
+              <w:t>Ολικ</w:t>
+            </w:r>
+            <w:r>
+              <w:t>ή</w:t>
+            </w:r>
+            <w:r>
+              <w:t xml:space="preserve"> Συμμετοχή του </w:t>
+            </w:r>
+            <w:r>
+              <w:rPr>
+                <w:lang w:val="en-US"/>
+              </w:rPr>
+              <w:t>Veterinarian</w:t>
             </w:r>
           </w:p>
         </w:tc>
@@ -6762,16 +7888,18 @@
         <w:tc>
           <w:tcPr>
             <w:tcW w:w="2376" w:type="dxa"/>
-            <w:vMerge/>
-            <w:tcBorders>
-              <w:bottom w:val="nil"/>
-            </w:tcBorders>
-            <w:shd w:val="clear" w:color="auto" w:fill="D9D9D9" w:themeFill="background1" w:themeFillShade="D9"/>
-          </w:tcPr>
-          <w:p>
-            <w:pPr>
-              <w:spacing w:after="0"/>
-            </w:pPr>
+            <w:shd w:val="clear" w:color="auto" w:fill="C6D9F1" w:themeFill="text2" w:themeFillTint="33"/>
+          </w:tcPr>
+          <w:p>
+            <w:pPr>
+              <w:spacing w:after="0"/>
+            </w:pPr>
+            <w:r>
+              <w:rPr>
+                <w:b/>
+              </w:rPr>
+              <w:t>Γνωρίσματα</w:t>
+            </w:r>
           </w:p>
         </w:tc>
         <w:tc>
@@ -6781,86 +7909,9 @@
           <w:p>
             <w:pPr>
               <w:spacing w:after="0"/>
-              <w:rPr>
-                <w:lang w:val="en-US"/>
-              </w:rPr>
-            </w:pPr>
-            <w:r>
-              <w:rPr>
-                <w:lang w:val="en-US"/>
-              </w:rPr>
-              <w:t>disease</w:t>
-            </w:r>
-          </w:p>
-        </w:tc>
-      </w:tr>
-      <w:tr>
-        <w:tc>
-          <w:tcPr>
-            <w:tcW w:w="2376" w:type="dxa"/>
-            <w:tcBorders>
-              <w:top w:val="nil"/>
-              <w:bottom w:val="nil"/>
-            </w:tcBorders>
-            <w:shd w:val="clear" w:color="auto" w:fill="D9D9D9" w:themeFill="background1" w:themeFillShade="D9"/>
-          </w:tcPr>
-          <w:p>
-            <w:pPr>
-              <w:spacing w:after="0"/>
-            </w:pPr>
-          </w:p>
-        </w:tc>
-        <w:tc>
-          <w:tcPr>
-            <w:tcW w:w="6146" w:type="dxa"/>
-          </w:tcPr>
-          <w:p>
-            <w:pPr>
-              <w:spacing w:after="0"/>
-              <w:rPr>
-                <w:lang w:val="en-US"/>
-              </w:rPr>
-            </w:pPr>
-            <w:r>
-              <w:rPr>
-                <w:lang w:val="en-US"/>
-              </w:rPr>
-              <w:t>daily dosage</w:t>
-            </w:r>
-          </w:p>
-        </w:tc>
-      </w:tr>
-      <w:tr>
-        <w:tc>
-          <w:tcPr>
-            <w:tcW w:w="2376" w:type="dxa"/>
-            <w:tcBorders>
-              <w:top w:val="nil"/>
-            </w:tcBorders>
-            <w:shd w:val="clear" w:color="auto" w:fill="D9D9D9" w:themeFill="background1" w:themeFillShade="D9"/>
-          </w:tcPr>
-          <w:p>
-            <w:pPr>
-              <w:spacing w:after="0"/>
-            </w:pPr>
-          </w:p>
-        </w:tc>
-        <w:tc>
-          <w:tcPr>
-            <w:tcW w:w="6146" w:type="dxa"/>
-          </w:tcPr>
-          <w:p>
-            <w:pPr>
-              <w:spacing w:after="0"/>
-              <w:rPr>
-                <w:lang w:val="en-US"/>
-              </w:rPr>
-            </w:pPr>
-            <w:r>
-              <w:rPr>
-                <w:lang w:val="en-US"/>
-              </w:rPr>
-              <w:t>vet signature</w:t>
+            </w:pPr>
+            <w:r>
+              <w:t>-</w:t>
             </w:r>
           </w:p>
         </w:tc>
@@ -6868,11 +7919,6 @@
     </w:tbl>
     <w:p>
       <w:pPr>
-        <w:pStyle w:val="2"/>
-        <w:numPr>
-          <w:ilvl w:val="0"/>
-          <w:numId w:val="0"/>
-        </w:numPr>
         <w:rPr>
           <w:lang w:val="en-US"/>
         </w:rPr>
@@ -6880,106 +7926,10 @@
     </w:p>
     <w:p>
       <w:pPr>
-        <w:pStyle w:val="2"/>
+        <w:rPr>
+          <w:lang w:val="en-US"/>
+        </w:rPr>
       </w:pPr>
-      <w:r>
-        <w:t>Καθορισμός Συσχετίσεων</w:t>
-      </w:r>
-      <w:bookmarkEnd w:id="8"/>
-    </w:p>
-    <w:p>
-      <w:r>
-        <w:t>{</w:t>
-      </w:r>
-      <w:proofErr w:type="spellStart"/>
-      <w:r>
-        <w:t>Ενας</w:t>
-      </w:r>
-      <w:proofErr w:type="spellEnd"/>
-      <w:r>
-        <w:t xml:space="preserve"> </w:t>
-      </w:r>
-      <w:r>
-        <w:rPr>
-          <w:lang w:val="en-US"/>
-        </w:rPr>
-        <w:t>Owner</w:t>
-      </w:r>
-      <w:r>
-        <w:t xml:space="preserve"> </w:t>
-      </w:r>
-      <w:proofErr w:type="spellStart"/>
-      <w:r>
-        <w:t>μπορει</w:t>
-      </w:r>
-      <w:proofErr w:type="spellEnd"/>
-      <w:r>
-        <w:t xml:space="preserve"> να μην έχει </w:t>
-      </w:r>
-      <w:proofErr w:type="spellStart"/>
-      <w:r>
-        <w:t>κατοικιδιο</w:t>
-      </w:r>
-      <w:proofErr w:type="spellEnd"/>
-      <w:r>
-        <w:t xml:space="preserve">(?)- Ένα </w:t>
-      </w:r>
-      <w:proofErr w:type="spellStart"/>
-      <w:r>
-        <w:t>ζωο</w:t>
-      </w:r>
-      <w:proofErr w:type="spellEnd"/>
-      <w:r>
-        <w:t xml:space="preserve"> </w:t>
-      </w:r>
-      <w:proofErr w:type="spellStart"/>
-      <w:r>
-        <w:t>μπορει</w:t>
-      </w:r>
-      <w:proofErr w:type="spellEnd"/>
-      <w:r>
-        <w:t xml:space="preserve"> να </w:t>
-      </w:r>
-      <w:proofErr w:type="spellStart"/>
-      <w:r>
-        <w:t>εχει</w:t>
-      </w:r>
-      <w:proofErr w:type="spellEnd"/>
-      <w:r>
-        <w:t xml:space="preserve"> </w:t>
-      </w:r>
-      <w:proofErr w:type="spellStart"/>
-      <w:r>
-        <w:t>πολλους</w:t>
-      </w:r>
-      <w:proofErr w:type="spellEnd"/>
-      <w:r>
-        <w:t xml:space="preserve"> </w:t>
-      </w:r>
-      <w:proofErr w:type="spellStart"/>
-      <w:r>
-        <w:t>κτηνιατρους</w:t>
-      </w:r>
-      <w:proofErr w:type="spellEnd"/>
-      <w:r>
-        <w:t>(?))</w:t>
-      </w:r>
-    </w:p>
-    <w:p>
-      <w:r>
-        <w:t xml:space="preserve">Παράδειγμα για τη </w:t>
-      </w:r>
-      <w:proofErr w:type="spellStart"/>
-      <w:r>
-        <w:rPr>
-          <w:lang w:val="en-US"/>
-        </w:rPr>
-        <w:t>FlightsDB</w:t>
-      </w:r>
-      <w:proofErr w:type="spellEnd"/>
-      <w:r>
-        <w:t>:</w:t>
-      </w:r>
     </w:p>
     <w:tbl>
       <w:tblPr>
@@ -7029,19 +7979,11 @@
                 <w:lang w:val="en-US"/>
               </w:rPr>
             </w:pPr>
-            <w:proofErr w:type="spellStart"/>
-            <w:r>
-              <w:rPr>
-                <w:lang w:val="en-US"/>
-              </w:rPr>
-              <w:t>Owner_Has_Animal</w:t>
-            </w:r>
-            <w:proofErr w:type="spellEnd"/>
-            <w:r>
-              <w:rPr>
-                <w:lang w:val="en-US"/>
-              </w:rPr>
-              <w:t xml:space="preserve">  (Animal Owner – Animal)</w:t>
+            <w:r>
+              <w:rPr>
+                <w:lang w:val="en-US"/>
+              </w:rPr>
+              <w:t>Animal undergoes Diagnostic Test</w:t>
             </w:r>
           </w:p>
         </w:tc>
@@ -7076,10 +8018,28 @@
               <w:spacing w:after="0"/>
             </w:pPr>
             <w:r>
-              <w:t xml:space="preserve">Κάθε </w:t>
-            </w:r>
-            <w:r>
-              <w:t>ιδιοκτήτης πρέπει να έχει ένα ή περισσότερα ζώα. Κάθε ζώο ανήκει σε έναν ιδιοκτήτη.</w:t>
+              <w:t xml:space="preserve">Κάθε ζώο μπορεί να υποστεί πολλά διαγνωστικά </w:t>
+            </w:r>
+            <w:r>
+              <w:rPr>
+                <w:lang w:val="en-US"/>
+              </w:rPr>
+              <w:t>test</w:t>
+            </w:r>
+            <w:r>
+              <w:t xml:space="preserve">. </w:t>
+            </w:r>
+            <w:r>
+              <w:rPr>
+                <w:lang w:val="en-US"/>
+              </w:rPr>
+              <w:t>Test</w:t>
+            </w:r>
+            <w:r>
+              <w:t xml:space="preserve"> </w:t>
+            </w:r>
+            <w:r>
+              <w:t>χωρίς ζώο δεν υπάρχει.</w:t>
             </w:r>
           </w:p>
         </w:tc>
@@ -7112,24 +8072,12 @@
           <w:p>
             <w:pPr>
               <w:spacing w:after="0"/>
-            </w:pPr>
-            <w:r>
-              <w:rPr>
-                <w:lang w:val="en-US"/>
-              </w:rPr>
-              <w:t>Has</w:t>
-            </w:r>
-            <w:r>
-              <w:t>-</w:t>
-            </w:r>
-            <w:r>
-              <w:rPr>
-                <w:lang w:val="en-US"/>
-              </w:rPr>
-              <w:t>A</w:t>
-            </w:r>
-            <w:r>
-              <w:t xml:space="preserve"> { Αναδρομική, Προσδιορίζουσα}</w:t>
+              <w:rPr>
+                <w:lang w:val="en-US"/>
+              </w:rPr>
+            </w:pPr>
+            <w:r>
+              <w:t>Προσδιορίζουσα</w:t>
             </w:r>
           </w:p>
         </w:tc>
@@ -7151,7 +8099,6 @@
               <w:rPr>
                 <w:b/>
               </w:rPr>
-              <w:lastRenderedPageBreak/>
               <w:t xml:space="preserve">Λόγος </w:t>
             </w:r>
             <w:proofErr w:type="spellStart"/>
@@ -7171,12 +8118,15 @@
           <w:p>
             <w:pPr>
               <w:spacing w:after="0"/>
-            </w:pPr>
-            <w:r>
-              <w:t>1:</w:t>
-            </w:r>
-            <w:r>
-              <w:t>Ν</w:t>
+              <w:rPr>
+                <w:lang w:val="en-US"/>
+              </w:rPr>
+            </w:pPr>
+            <w:r>
+              <w:rPr>
+                <w:lang w:val="en-US"/>
+              </w:rPr>
+              <w:t>1:N</w:t>
             </w:r>
           </w:p>
         </w:tc>
@@ -7218,10 +8168,7 @@
               </w:rPr>
             </w:pPr>
             <w:r>
-              <w:t>Ολική</w:t>
-            </w:r>
-            <w:r>
-              <w:t xml:space="preserve"> Συμμετοχή του </w:t>
+              <w:t xml:space="preserve">Μερική Συμμετοχή του </w:t>
             </w:r>
             <w:r>
               <w:rPr>
@@ -7256,19 +8203,14 @@
             <w:pPr>
               <w:spacing w:after="0"/>
             </w:pPr>
-            <w:proofErr w:type="spellStart"/>
-            <w:r>
-              <w:t>Ολικ</w:t>
-            </w:r>
-            <w:proofErr w:type="spellEnd"/>
-            <w:r>
-              <w:t xml:space="preserve"> Συμμετοχή του </w:t>
-            </w:r>
-            <w:r>
-              <w:rPr>
-                <w:lang w:val="en-US"/>
-              </w:rPr>
-              <w:t>Animal</w:t>
+            <w:r>
+              <w:t xml:space="preserve">Ολική Συμμετοχή του </w:t>
+            </w:r>
+            <w:r>
+              <w:rPr>
+                <w:lang w:val="en-US"/>
+              </w:rPr>
+              <w:t>Diagnostic</w:t>
             </w:r>
             <w:r>
               <w:t xml:space="preserve"> </w:t>
@@ -7277,7 +8219,7 @@
               <w:rPr>
                 <w:lang w:val="en-US"/>
               </w:rPr>
-              <w:t>Owner</w:t>
+              <w:t>Test</w:t>
             </w:r>
           </w:p>
         </w:tc>
@@ -7314,6 +8256,31 @@
           </w:p>
         </w:tc>
       </w:tr>
+    </w:tbl>
+    <w:p>
+      <w:pPr>
+        <w:rPr>
+          <w:lang w:val="en-US"/>
+        </w:rPr>
+      </w:pPr>
+    </w:p>
+    <w:p>
+      <w:pPr>
+        <w:rPr>
+          <w:lang w:val="en-US"/>
+        </w:rPr>
+      </w:pPr>
+    </w:p>
+    <w:tbl>
+      <w:tblPr>
+        <w:tblStyle w:val="af1"/>
+        <w:tblW w:w="0" w:type="auto"/>
+        <w:tblLook w:val="04A0"/>
+      </w:tblPr>
+      <w:tblGrid>
+        <w:gridCol w:w="2376"/>
+        <w:gridCol w:w="6146"/>
+      </w:tblGrid>
       <w:tr>
         <w:tc>
           <w:tcPr>
@@ -7356,7 +8323,7 @@
               <w:rPr>
                 <w:lang w:val="en-US"/>
               </w:rPr>
-              <w:t>Animal is under care of a veterinarian</w:t>
+              <w:t>Animal undergoes Vaccinations</w:t>
             </w:r>
           </w:p>
         </w:tc>
@@ -7391,7 +8358,16 @@
               <w:spacing w:after="0"/>
             </w:pPr>
             <w:r>
-              <w:t>Κάθε ζώο μπορεί να παρακολουθείται από έναν ή περισσότερους κτηνιάτρους. Κάθε κτηνίατρος μπορεί να έχει υπό την ευθύνη του πολλά ζώα.</w:t>
+              <w:t>Κάθε ζώο μπορεί να εμβολιαστεί πολλαπλές φορές. Κάθε εμβολιασμός</w:t>
+            </w:r>
+            <w:r>
+              <w:rPr>
+                <w:lang w:val="en-US"/>
+              </w:rPr>
+              <w:t xml:space="preserve"> </w:t>
+            </w:r>
+            <w:r>
+              <w:t>απαιτεί ζώο.</w:t>
             </w:r>
           </w:p>
         </w:tc>
@@ -7426,25 +8402,7 @@
               <w:spacing w:after="0"/>
             </w:pPr>
             <w:r>
-              <w:rPr>
-                <w:lang w:val="en-US"/>
-              </w:rPr>
-              <w:t>Has</w:t>
-            </w:r>
-            <w:r>
-              <w:t>-</w:t>
-            </w:r>
-            <w:r>
-              <w:rPr>
-                <w:lang w:val="en-US"/>
-              </w:rPr>
-              <w:t>A</w:t>
-            </w:r>
-            <w:r>
-              <w:t xml:space="preserve"> </w:t>
-            </w:r>
-            <w:r>
-              <w:t>{Απροσδιόριστη}</w:t>
+              <w:t>Προσδιορίζουσα</w:t>
             </w:r>
           </w:p>
         </w:tc>
@@ -7485,15 +8443,15 @@
           <w:p>
             <w:pPr>
               <w:spacing w:after="0"/>
-              <w:rPr>
-                <w:lang w:val="en-US"/>
-              </w:rPr>
-            </w:pPr>
-            <w:r>
-              <w:rPr>
-                <w:lang w:val="en-US"/>
-              </w:rPr>
-              <w:t>N:M</w:t>
+            </w:pPr>
+            <w:r>
+              <w:t>1:</w:t>
+            </w:r>
+            <w:r>
+              <w:rPr>
+                <w:lang w:val="en-US"/>
+              </w:rPr>
+              <w:t>N</w:t>
             </w:r>
           </w:p>
         </w:tc>
@@ -7530,15 +8488,9 @@
           <w:p>
             <w:pPr>
               <w:spacing w:after="0"/>
-              <w:rPr>
-                <w:lang w:val="en-US"/>
-              </w:rPr>
-            </w:pPr>
-            <w:r>
-              <w:t>Μερική</w:t>
-            </w:r>
-            <w:r>
-              <w:t xml:space="preserve"> Συμμετοχή του </w:t>
+            </w:pPr>
+            <w:r>
+              <w:t xml:space="preserve">Μερική Συμμετοχή του </w:t>
             </w:r>
             <w:r>
               <w:rPr>
@@ -7572,6 +8524,283 @@
           <w:p>
             <w:pPr>
               <w:spacing w:after="0"/>
+            </w:pPr>
+            <w:r>
+              <w:t xml:space="preserve">Ολική Συμμετοχή του </w:t>
+            </w:r>
+            <w:r>
+              <w:rPr>
+                <w:lang w:val="en-US"/>
+              </w:rPr>
+              <w:t>Vaccinations</w:t>
+            </w:r>
+          </w:p>
+        </w:tc>
+      </w:tr>
+      <w:tr>
+        <w:tc>
+          <w:tcPr>
+            <w:tcW w:w="2376" w:type="dxa"/>
+            <w:shd w:val="clear" w:color="auto" w:fill="C6D9F1" w:themeFill="text2" w:themeFillTint="33"/>
+          </w:tcPr>
+          <w:p>
+            <w:pPr>
+              <w:spacing w:after="0"/>
+            </w:pPr>
+            <w:r>
+              <w:rPr>
+                <w:b/>
+              </w:rPr>
+              <w:t>Γνωρίσματα</w:t>
+            </w:r>
+          </w:p>
+        </w:tc>
+        <w:tc>
+          <w:tcPr>
+            <w:tcW w:w="6146" w:type="dxa"/>
+          </w:tcPr>
+          <w:p>
+            <w:pPr>
+              <w:spacing w:after="0"/>
+            </w:pPr>
+            <w:r>
+              <w:t>-</w:t>
+            </w:r>
+          </w:p>
+        </w:tc>
+      </w:tr>
+    </w:tbl>
+    <w:p>
+      <w:pPr>
+        <w:rPr>
+          <w:lang w:val="en-US"/>
+        </w:rPr>
+      </w:pPr>
+    </w:p>
+    <w:p>
+      <w:pPr>
+        <w:rPr>
+          <w:lang w:val="en-US"/>
+        </w:rPr>
+      </w:pPr>
+    </w:p>
+    <w:tbl>
+      <w:tblPr>
+        <w:tblStyle w:val="af1"/>
+        <w:tblW w:w="0" w:type="auto"/>
+        <w:tblLook w:val="04A0"/>
+      </w:tblPr>
+      <w:tblGrid>
+        <w:gridCol w:w="2376"/>
+        <w:gridCol w:w="6146"/>
+      </w:tblGrid>
+      <w:tr>
+        <w:tc>
+          <w:tcPr>
+            <w:tcW w:w="2376" w:type="dxa"/>
+            <w:shd w:val="clear" w:color="auto" w:fill="C6D9F1" w:themeFill="text2" w:themeFillTint="33"/>
+          </w:tcPr>
+          <w:p>
+            <w:pPr>
+              <w:spacing w:after="0"/>
+              <w:rPr>
+                <w:b/>
+              </w:rPr>
+            </w:pPr>
+            <w:r>
+              <w:rPr>
+                <w:b/>
+              </w:rPr>
+              <w:t xml:space="preserve">Όνομα </w:t>
+            </w:r>
+            <w:r>
+              <w:rPr>
+                <w:b/>
+              </w:rPr>
+              <w:t>Συσχέτισης</w:t>
+            </w:r>
+          </w:p>
+        </w:tc>
+        <w:tc>
+          <w:tcPr>
+            <w:tcW w:w="6146" w:type="dxa"/>
+          </w:tcPr>
+          <w:p>
+            <w:pPr>
+              <w:spacing w:after="0"/>
+              <w:rPr>
+                <w:lang w:val="en-US"/>
+              </w:rPr>
+            </w:pPr>
+            <w:r>
+              <w:rPr>
+                <w:lang w:val="en-US"/>
+              </w:rPr>
+              <w:t>Animal undergoes Surgeries</w:t>
+            </w:r>
+          </w:p>
+        </w:tc>
+      </w:tr>
+      <w:tr>
+        <w:tc>
+          <w:tcPr>
+            <w:tcW w:w="2376" w:type="dxa"/>
+            <w:shd w:val="clear" w:color="auto" w:fill="C6D9F1" w:themeFill="text2" w:themeFillTint="33"/>
+          </w:tcPr>
+          <w:p>
+            <w:pPr>
+              <w:spacing w:after="0"/>
+              <w:rPr>
+                <w:b/>
+              </w:rPr>
+            </w:pPr>
+            <w:r>
+              <w:rPr>
+                <w:b/>
+              </w:rPr>
+              <w:t>Περιγραφή</w:t>
+            </w:r>
+          </w:p>
+        </w:tc>
+        <w:tc>
+          <w:tcPr>
+            <w:tcW w:w="6146" w:type="dxa"/>
+          </w:tcPr>
+          <w:p>
+            <w:pPr>
+              <w:spacing w:after="0"/>
+            </w:pPr>
+            <w:r>
+              <w:t>Κάθε ζώο μπορεί να υποβληθεί σε εγχείρηση καμία ή πολλαπλές φορές στη ζωή του. Εγχείρηση</w:t>
+            </w:r>
+            <w:r>
+              <w:t xml:space="preserve"> </w:t>
+            </w:r>
+            <w:r>
+              <w:t>χωρίς ύπαρξη ζώου δεν είναι εφικτή.</w:t>
+            </w:r>
+          </w:p>
+        </w:tc>
+      </w:tr>
+      <w:tr>
+        <w:tc>
+          <w:tcPr>
+            <w:tcW w:w="2376" w:type="dxa"/>
+            <w:shd w:val="clear" w:color="auto" w:fill="C6D9F1" w:themeFill="text2" w:themeFillTint="33"/>
+          </w:tcPr>
+          <w:p>
+            <w:pPr>
+              <w:spacing w:after="0"/>
+              <w:rPr>
+                <w:b/>
+              </w:rPr>
+            </w:pPr>
+            <w:r>
+              <w:rPr>
+                <w:b/>
+              </w:rPr>
+              <w:t>Ιδιότητες</w:t>
+            </w:r>
+          </w:p>
+        </w:tc>
+        <w:tc>
+          <w:tcPr>
+            <w:tcW w:w="6146" w:type="dxa"/>
+          </w:tcPr>
+          <w:p>
+            <w:pPr>
+              <w:spacing w:after="0"/>
+              <w:rPr>
+                <w:lang w:val="en-US"/>
+              </w:rPr>
+            </w:pPr>
+            <w:r>
+              <w:t>Προσδιορίζουσα</w:t>
+            </w:r>
+          </w:p>
+        </w:tc>
+      </w:tr>
+      <w:tr>
+        <w:tc>
+          <w:tcPr>
+            <w:tcW w:w="2376" w:type="dxa"/>
+            <w:shd w:val="clear" w:color="auto" w:fill="C6D9F1" w:themeFill="text2" w:themeFillTint="33"/>
+          </w:tcPr>
+          <w:p>
+            <w:pPr>
+              <w:spacing w:after="0"/>
+              <w:rPr>
+                <w:b/>
+              </w:rPr>
+            </w:pPr>
+            <w:r>
+              <w:rPr>
+                <w:b/>
+              </w:rPr>
+              <w:t xml:space="preserve">Λόγος </w:t>
+            </w:r>
+            <w:proofErr w:type="spellStart"/>
+            <w:r>
+              <w:rPr>
+                <w:b/>
+              </w:rPr>
+              <w:t>πληθικότητας</w:t>
+            </w:r>
+            <w:proofErr w:type="spellEnd"/>
+          </w:p>
+        </w:tc>
+        <w:tc>
+          <w:tcPr>
+            <w:tcW w:w="6146" w:type="dxa"/>
+          </w:tcPr>
+          <w:p>
+            <w:pPr>
+              <w:spacing w:after="0"/>
+              <w:rPr>
+                <w:lang w:val="en-US"/>
+              </w:rPr>
+            </w:pPr>
+            <w:r>
+              <w:rPr>
+                <w:lang w:val="en-US"/>
+              </w:rPr>
+              <w:t>1:N</w:t>
+            </w:r>
+          </w:p>
+        </w:tc>
+      </w:tr>
+      <w:tr>
+        <w:tc>
+          <w:tcPr>
+            <w:tcW w:w="2376" w:type="dxa"/>
+            <w:vMerge w:val="restart"/>
+            <w:shd w:val="clear" w:color="auto" w:fill="C6D9F1" w:themeFill="text2" w:themeFillTint="33"/>
+          </w:tcPr>
+          <w:p>
+            <w:pPr>
+              <w:tabs>
+                <w:tab w:val="right" w:pos="2160"/>
+              </w:tabs>
+              <w:spacing w:after="0"/>
+              <w:rPr>
+                <w:b/>
+              </w:rPr>
+            </w:pPr>
+            <w:r>
+              <w:rPr>
+                <w:b/>
+              </w:rPr>
+              <w:t>Συμμετοχή</w:t>
+            </w:r>
+          </w:p>
+        </w:tc>
+        <w:tc>
+          <w:tcPr>
+            <w:tcW w:w="6146" w:type="dxa"/>
+          </w:tcPr>
+          <w:p>
+            <w:pPr>
+              <w:spacing w:after="0"/>
               <w:rPr>
                 <w:lang w:val="en-US"/>
               </w:rPr>
@@ -7583,7 +8812,385 @@
               <w:rPr>
                 <w:lang w:val="en-US"/>
               </w:rPr>
-              <w:t>Veterinarian</w:t>
+              <w:t>Animal</w:t>
+            </w:r>
+          </w:p>
+        </w:tc>
+      </w:tr>
+      <w:tr>
+        <w:tc>
+          <w:tcPr>
+            <w:tcW w:w="2376" w:type="dxa"/>
+            <w:vMerge/>
+            <w:shd w:val="clear" w:color="auto" w:fill="C6D9F1" w:themeFill="text2" w:themeFillTint="33"/>
+          </w:tcPr>
+          <w:p>
+            <w:pPr>
+              <w:spacing w:after="0"/>
+              <w:rPr>
+                <w:b/>
+              </w:rPr>
+            </w:pPr>
+          </w:p>
+        </w:tc>
+        <w:tc>
+          <w:tcPr>
+            <w:tcW w:w="6146" w:type="dxa"/>
+          </w:tcPr>
+          <w:p>
+            <w:pPr>
+              <w:spacing w:after="0"/>
+              <w:rPr>
+                <w:lang w:val="en-US"/>
+              </w:rPr>
+            </w:pPr>
+            <w:r>
+              <w:t>Ολική Συμμετοχή τ</w:t>
+            </w:r>
+            <w:r>
+              <w:t xml:space="preserve">ου </w:t>
+            </w:r>
+            <w:r>
+              <w:rPr>
+                <w:lang w:val="en-US"/>
+              </w:rPr>
+              <w:t>Surgeries</w:t>
+            </w:r>
+          </w:p>
+        </w:tc>
+      </w:tr>
+      <w:tr>
+        <w:tc>
+          <w:tcPr>
+            <w:tcW w:w="2376" w:type="dxa"/>
+            <w:shd w:val="clear" w:color="auto" w:fill="C6D9F1" w:themeFill="text2" w:themeFillTint="33"/>
+          </w:tcPr>
+          <w:p>
+            <w:pPr>
+              <w:spacing w:after="0"/>
+            </w:pPr>
+            <w:r>
+              <w:rPr>
+                <w:b/>
+              </w:rPr>
+              <w:t>Γνωρίσματα</w:t>
+            </w:r>
+          </w:p>
+        </w:tc>
+        <w:tc>
+          <w:tcPr>
+            <w:tcW w:w="6146" w:type="dxa"/>
+          </w:tcPr>
+          <w:p>
+            <w:pPr>
+              <w:spacing w:after="0"/>
+            </w:pPr>
+            <w:r>
+              <w:t>-</w:t>
+            </w:r>
+          </w:p>
+        </w:tc>
+      </w:tr>
+    </w:tbl>
+    <w:p/>
+    <w:p/>
+    <w:tbl>
+      <w:tblPr>
+        <w:tblStyle w:val="af1"/>
+        <w:tblW w:w="0" w:type="auto"/>
+        <w:tblLook w:val="04A0"/>
+      </w:tblPr>
+      <w:tblGrid>
+        <w:gridCol w:w="2376"/>
+        <w:gridCol w:w="6146"/>
+      </w:tblGrid>
+      <w:tr>
+        <w:tc>
+          <w:tcPr>
+            <w:tcW w:w="2376" w:type="dxa"/>
+            <w:shd w:val="clear" w:color="auto" w:fill="C6D9F1" w:themeFill="text2" w:themeFillTint="33"/>
+          </w:tcPr>
+          <w:p>
+            <w:pPr>
+              <w:spacing w:after="0"/>
+              <w:rPr>
+                <w:b/>
+              </w:rPr>
+            </w:pPr>
+            <w:r>
+              <w:rPr>
+                <w:b/>
+              </w:rPr>
+              <w:lastRenderedPageBreak/>
+              <w:t xml:space="preserve">Όνομα </w:t>
+            </w:r>
+            <w:r>
+              <w:rPr>
+                <w:b/>
+              </w:rPr>
+              <w:t>Συσχέτισης</w:t>
+            </w:r>
+          </w:p>
+        </w:tc>
+        <w:tc>
+          <w:tcPr>
+            <w:tcW w:w="6146" w:type="dxa"/>
+          </w:tcPr>
+          <w:p>
+            <w:pPr>
+              <w:spacing w:after="0"/>
+              <w:rPr>
+                <w:lang w:val="en-US"/>
+              </w:rPr>
+            </w:pPr>
+            <w:r>
+              <w:rPr>
+                <w:lang w:val="en-US"/>
+              </w:rPr>
+              <w:t xml:space="preserve">Animal undergoes </w:t>
+            </w:r>
+            <w:proofErr w:type="spellStart"/>
+            <w:r>
+              <w:rPr>
+                <w:lang w:val="en-US"/>
+              </w:rPr>
+              <w:t>Antiparasitic</w:t>
+            </w:r>
+            <w:proofErr w:type="spellEnd"/>
+            <w:r>
+              <w:rPr>
+                <w:lang w:val="en-US"/>
+              </w:rPr>
+              <w:t xml:space="preserve"> Treatments</w:t>
+            </w:r>
+          </w:p>
+        </w:tc>
+      </w:tr>
+      <w:tr>
+        <w:tc>
+          <w:tcPr>
+            <w:tcW w:w="2376" w:type="dxa"/>
+            <w:shd w:val="clear" w:color="auto" w:fill="C6D9F1" w:themeFill="text2" w:themeFillTint="33"/>
+          </w:tcPr>
+          <w:p>
+            <w:pPr>
+              <w:spacing w:after="0"/>
+              <w:rPr>
+                <w:b/>
+              </w:rPr>
+            </w:pPr>
+            <w:r>
+              <w:rPr>
+                <w:b/>
+              </w:rPr>
+              <w:t>Περιγραφή</w:t>
+            </w:r>
+          </w:p>
+        </w:tc>
+        <w:tc>
+          <w:tcPr>
+            <w:tcW w:w="6146" w:type="dxa"/>
+          </w:tcPr>
+          <w:p>
+            <w:pPr>
+              <w:spacing w:after="0"/>
+            </w:pPr>
+            <w:r>
+              <w:t>Κάθε ζώο μπορεί να υποστεί</w:t>
+            </w:r>
+            <w:r>
+              <w:t xml:space="preserve"> πολλές θεραπείες</w:t>
+            </w:r>
+            <w:r>
+              <w:t xml:space="preserve">. </w:t>
+            </w:r>
+            <w:r>
+              <w:t>Κάθε θεραπεία εφαρμόζεται σε ένα συγκεκριμένο ζώο</w:t>
+            </w:r>
+            <w:r>
+              <w:t>.</w:t>
+            </w:r>
+          </w:p>
+        </w:tc>
+      </w:tr>
+      <w:tr>
+        <w:tc>
+          <w:tcPr>
+            <w:tcW w:w="2376" w:type="dxa"/>
+            <w:shd w:val="clear" w:color="auto" w:fill="C6D9F1" w:themeFill="text2" w:themeFillTint="33"/>
+          </w:tcPr>
+          <w:p>
+            <w:pPr>
+              <w:spacing w:after="0"/>
+              <w:rPr>
+                <w:b/>
+              </w:rPr>
+            </w:pPr>
+            <w:r>
+              <w:rPr>
+                <w:b/>
+              </w:rPr>
+              <w:t>Ιδιότητες</w:t>
+            </w:r>
+          </w:p>
+        </w:tc>
+        <w:tc>
+          <w:tcPr>
+            <w:tcW w:w="6146" w:type="dxa"/>
+          </w:tcPr>
+          <w:p>
+            <w:pPr>
+              <w:spacing w:after="0"/>
+              <w:rPr>
+                <w:lang w:val="en-US"/>
+              </w:rPr>
+            </w:pPr>
+            <w:r>
+              <w:t>Προσδιορίζουσα</w:t>
+            </w:r>
+          </w:p>
+        </w:tc>
+      </w:tr>
+      <w:tr>
+        <w:tc>
+          <w:tcPr>
+            <w:tcW w:w="2376" w:type="dxa"/>
+            <w:shd w:val="clear" w:color="auto" w:fill="C6D9F1" w:themeFill="text2" w:themeFillTint="33"/>
+          </w:tcPr>
+          <w:p>
+            <w:pPr>
+              <w:spacing w:after="0"/>
+              <w:rPr>
+                <w:b/>
+              </w:rPr>
+            </w:pPr>
+            <w:r>
+              <w:rPr>
+                <w:b/>
+              </w:rPr>
+              <w:t xml:space="preserve">Λόγος </w:t>
+            </w:r>
+            <w:proofErr w:type="spellStart"/>
+            <w:r>
+              <w:rPr>
+                <w:b/>
+              </w:rPr>
+              <w:t>πληθικότητας</w:t>
+            </w:r>
+            <w:proofErr w:type="spellEnd"/>
+          </w:p>
+        </w:tc>
+        <w:tc>
+          <w:tcPr>
+            <w:tcW w:w="6146" w:type="dxa"/>
+          </w:tcPr>
+          <w:p>
+            <w:pPr>
+              <w:spacing w:after="0"/>
+              <w:rPr>
+                <w:lang w:val="en-US"/>
+              </w:rPr>
+            </w:pPr>
+            <w:r>
+              <w:rPr>
+                <w:lang w:val="en-US"/>
+              </w:rPr>
+              <w:t>1:N</w:t>
+            </w:r>
+          </w:p>
+        </w:tc>
+      </w:tr>
+      <w:tr>
+        <w:tc>
+          <w:tcPr>
+            <w:tcW w:w="2376" w:type="dxa"/>
+            <w:vMerge w:val="restart"/>
+            <w:shd w:val="clear" w:color="auto" w:fill="C6D9F1" w:themeFill="text2" w:themeFillTint="33"/>
+          </w:tcPr>
+          <w:p>
+            <w:pPr>
+              <w:tabs>
+                <w:tab w:val="right" w:pos="2160"/>
+              </w:tabs>
+              <w:spacing w:after="0"/>
+              <w:rPr>
+                <w:b/>
+              </w:rPr>
+            </w:pPr>
+            <w:r>
+              <w:rPr>
+                <w:b/>
+              </w:rPr>
+              <w:t>Συμμετοχή</w:t>
+            </w:r>
+          </w:p>
+        </w:tc>
+        <w:tc>
+          <w:tcPr>
+            <w:tcW w:w="6146" w:type="dxa"/>
+          </w:tcPr>
+          <w:p>
+            <w:pPr>
+              <w:spacing w:after="0"/>
+              <w:rPr>
+                <w:lang w:val="en-US"/>
+              </w:rPr>
+            </w:pPr>
+            <w:r>
+              <w:t xml:space="preserve">Μερική Συμμετοχή του </w:t>
+            </w:r>
+            <w:r>
+              <w:rPr>
+                <w:lang w:val="en-US"/>
+              </w:rPr>
+              <w:t>Animal</w:t>
+            </w:r>
+          </w:p>
+        </w:tc>
+      </w:tr>
+      <w:tr>
+        <w:tc>
+          <w:tcPr>
+            <w:tcW w:w="2376" w:type="dxa"/>
+            <w:vMerge/>
+            <w:shd w:val="clear" w:color="auto" w:fill="C6D9F1" w:themeFill="text2" w:themeFillTint="33"/>
+          </w:tcPr>
+          <w:p>
+            <w:pPr>
+              <w:spacing w:after="0"/>
+              <w:rPr>
+                <w:b/>
+              </w:rPr>
+            </w:pPr>
+          </w:p>
+        </w:tc>
+        <w:tc>
+          <w:tcPr>
+            <w:tcW w:w="6146" w:type="dxa"/>
+          </w:tcPr>
+          <w:p>
+            <w:pPr>
+              <w:spacing w:after="0"/>
+            </w:pPr>
+            <w:r>
+              <w:t xml:space="preserve">Ολική Συμμετοχή του </w:t>
+            </w:r>
+            <w:proofErr w:type="spellStart"/>
+            <w:r>
+              <w:rPr>
+                <w:lang w:val="en-US"/>
+              </w:rPr>
+              <w:t>Antiparasitic</w:t>
+            </w:r>
+            <w:proofErr w:type="spellEnd"/>
+            <w:r>
+              <w:t xml:space="preserve"> </w:t>
+            </w:r>
+            <w:r>
+              <w:rPr>
+                <w:lang w:val="en-US"/>
+              </w:rPr>
+              <w:t>Treatments</w:t>
             </w:r>
           </w:p>
         </w:tc>
@@ -7626,7 +9233,7 @@
       <w:pPr>
         <w:pStyle w:val="2"/>
       </w:pPr>
-      <w:bookmarkStart w:id="9" w:name="_Toc528749152"/>
+      <w:bookmarkStart w:id="9" w:name="_Toc214200088"/>
       <w:r>
         <w:t>Διάγραμμα Οντοτήτων/Συσχετίσεων</w:t>
       </w:r>
@@ -7661,23 +9268,12 @@
         <w:t>}</w:t>
       </w:r>
     </w:p>
+    <w:p/>
     <w:p>
-      <w:r>
-        <w:t xml:space="preserve">Παράδειγμα για τη </w:t>
-      </w:r>
-      <w:proofErr w:type="spellStart"/>
-      <w:r>
-        <w:rPr>
-          <w:lang w:val="en-US"/>
-        </w:rPr>
-        <w:t>FlightsDB</w:t>
-      </w:r>
-      <w:proofErr w:type="spellEnd"/>
-      <w:r>
-        <w:t>:</w:t>
-      </w:r>
-    </w:p>
-    <w:p>
+      <w:pPr>
+        <w:ind w:left="-709"/>
+        <w:jc w:val="center"/>
+      </w:pPr>
       <w:r>
         <w:rPr>
           <w:noProof/>
@@ -7685,8 +9281,8 @@
         </w:rPr>
         <w:drawing>
           <wp:inline distT="0" distB="0" distL="0" distR="0">
-            <wp:extent cx="5464661" cy="4698332"/>
-            <wp:effectExtent l="19050" t="0" r="2689" b="0"/>
+            <wp:extent cx="6041637" cy="5194395"/>
+            <wp:effectExtent l="19050" t="0" r="0" b="0"/>
             <wp:docPr id="3" name="Picture 4">
               <a:extLst xmlns:a="http://schemas.openxmlformats.org/drawingml/2006/main">
                 <a:ext uri="{FF2B5EF4-FFF2-40B4-BE49-F238E27FC236}">
@@ -7713,7 +9309,7 @@
                     </pic:cNvPicPr>
                   </pic:nvPicPr>
                   <pic:blipFill>
-                    <a:blip r:embed="rId6"/>
+                    <a:blip r:embed="rId7"/>
                     <a:stretch>
                       <a:fillRect/>
                     </a:stretch>
@@ -7721,7 +9317,7 @@
                   <pic:spPr>
                     <a:xfrm>
                       <a:off x="0" y="0"/>
-                      <a:ext cx="5466593" cy="4699993"/>
+                      <a:ext cx="6041637" cy="5194395"/>
                     </a:xfrm>
                     <a:prstGeom prst="rect">
                       <a:avLst/>
@@ -7734,28 +9330,20 @@
         </w:drawing>
       </w:r>
     </w:p>
-    <w:p/>
-    <w:p/>
-    <w:p/>
-    <w:p/>
-    <w:p/>
-    <w:p/>
-    <w:p/>
-    <w:p/>
     <w:p>
       <w:pPr>
         <w:spacing w:after="0"/>
         <w:jc w:val="left"/>
+        <w:rPr>
+          <w:lang w:val="en-US"/>
+        </w:rPr>
       </w:pPr>
-      <w:r>
-        <w:br w:type="page"/>
-      </w:r>
     </w:p>
     <w:p>
       <w:pPr>
         <w:pStyle w:val="1"/>
       </w:pPr>
-      <w:bookmarkStart w:id="10" w:name="_Toc528749153"/>
+      <w:bookmarkStart w:id="10" w:name="_Toc214200089"/>
       <w:r>
         <w:lastRenderedPageBreak/>
         <w:t>Σχεσιακό Μοντέλο</w:t>
@@ -7766,7 +9354,7 @@
       <w:pPr>
         <w:pStyle w:val="2"/>
       </w:pPr>
-      <w:bookmarkStart w:id="11" w:name="_Toc528749154"/>
+      <w:bookmarkStart w:id="11" w:name="_Toc214200090"/>
       <w:r>
         <w:t>Πεδία Ορισμού</w:t>
       </w:r>
@@ -8081,7 +9669,7 @@
       <w:pPr>
         <w:pStyle w:val="2"/>
       </w:pPr>
-      <w:bookmarkStart w:id="12" w:name="_Toc528749155"/>
+      <w:bookmarkStart w:id="12" w:name="_Toc214200091"/>
       <w:r>
         <w:t>Σχέσεις</w:t>
       </w:r>
@@ -8550,14 +10138,14 @@
       <w:pPr>
         <w:pStyle w:val="2"/>
       </w:pPr>
-      <w:bookmarkStart w:id="13" w:name="_Toc528749156"/>
+      <w:bookmarkStart w:id="13" w:name="_Toc214200092"/>
       <w:r>
         <w:t xml:space="preserve">Σχεσιακό </w:t>
       </w:r>
+      <w:r>
+        <w:t>Σχήμα</w:t>
+      </w:r>
       <w:bookmarkEnd w:id="13"/>
-      <w:r>
-        <w:t>Σχήμα</w:t>
-      </w:r>
     </w:p>
     <w:p>
       <w:r>
@@ -8675,7 +10263,7 @@
                     </pic:cNvPicPr>
                   </pic:nvPicPr>
                   <pic:blipFill>
-                    <a:blip r:embed="rId7" cstate="print">
+                    <a:blip r:embed="rId8" cstate="print">
                       <a:extLst>
                         <a:ext uri="{28A0092B-C50C-407E-A947-70E740481C1C}">
                           <a14:useLocalDpi xmlns="" xmlns:wpc="http://schemas.microsoft.com/office/word/2010/wordprocessingCanvas" xmlns:cx="http://schemas.microsoft.com/office/drawing/2014/chartex" xmlns:cx1="http://schemas.microsoft.com/office/drawing/2015/9/8/chartex" xmlns:cx2="http://schemas.microsoft.com/office/drawing/2015/10/21/chartex" xmlns:cx3="http://schemas.microsoft.com/office/drawing/2016/5/9/chartex" xmlns:cx4="http://schemas.microsoft.com/office/drawing/2016/5/10/chartex" xmlns:cx5="http://schemas.microsoft.com/office/drawing/2016/5/11/chartex" xmlns:cx6="http://schemas.microsoft.com/office/drawing/2016/5/12/chartex" xmlns:cx7="http://schemas.microsoft.com/office/drawing/2016/5/13/chartex" xmlns:cx8="http://schemas.microsoft.com/office/drawing/2016/5/14/chartex" xmlns:mc="http://schemas.openxmlformats.org/markup-compatibility/2006" xmlns:aink="http://schemas.microsoft.com/office/drawing/2016/ink" xmlns:am3d="http://schemas.microsoft.com/office/drawing/2017/model3d" xmlns:o="urn:schemas-microsoft-com:office:office" xmlns:v="urn:schemas-microsoft-com:vml" xmlns:wp14="http://schemas.microsoft.com/office/word/2010/wordprocessingDrawing" xmlns:w10="urn:schemas-microsoft-com:office:word" xmlns:w="http://schemas.openxmlformats.org/wordprocessingml/2006/main" xmlns:w14="http://schemas.microsoft.com/office/word/2010/wordml" xmlns:w15="http://schemas.microsoft.com/office/word/2012/wordml" xmlns:w16cex="http://schemas.microsoft.com/office/word/2018/wordml/cex" xmlns:w16cid="http://schemas.microsoft.com/office/word/2016/wordml/cid" xmlns:w16="http://schemas.microsoft.com/office/word/2018/wordml" xmlns:w16se="http://schemas.microsoft.com/office/word/2015/wordml/symex" xmlns:wpg="http://schemas.microsoft.com/office/word/2010/wordprocessingGroup" xmlns:wpi="http://schemas.microsoft.com/office/word/2010/wordprocessingInk" xmlns:wps="http://schemas.microsoft.com/office/word/2010/wordprocessingShape" xmlns:a14="http://schemas.microsoft.com/office/drawing/2010/main" val="0"/>
@@ -8713,7 +10301,7 @@
       <w:pPr>
         <w:pStyle w:val="2"/>
       </w:pPr>
-      <w:bookmarkStart w:id="15" w:name="_Toc528749157"/>
+      <w:bookmarkStart w:id="15" w:name="_Toc214200093"/>
       <w:r>
         <w:t>Όψεις</w:t>
       </w:r>
@@ -9119,7 +10707,7 @@
                     </pic:cNvPicPr>
                   </pic:nvPicPr>
                   <pic:blipFill>
-                    <a:blip r:embed="rId8" cstate="print">
+                    <a:blip r:embed="rId9" cstate="print">
                       <a:extLst>
                         <a:ext uri="{28A0092B-C50C-407E-A947-70E740481C1C}">
                           <a14:useLocalDpi xmlns="" xmlns:wpc="http://schemas.microsoft.com/office/word/2010/wordprocessingCanvas" xmlns:cx="http://schemas.microsoft.com/office/drawing/2014/chartex" xmlns:cx1="http://schemas.microsoft.com/office/drawing/2015/9/8/chartex" xmlns:cx2="http://schemas.microsoft.com/office/drawing/2015/10/21/chartex" xmlns:cx3="http://schemas.microsoft.com/office/drawing/2016/5/9/chartex" xmlns:cx4="http://schemas.microsoft.com/office/drawing/2016/5/10/chartex" xmlns:cx5="http://schemas.microsoft.com/office/drawing/2016/5/11/chartex" xmlns:cx6="http://schemas.microsoft.com/office/drawing/2016/5/12/chartex" xmlns:cx7="http://schemas.microsoft.com/office/drawing/2016/5/13/chartex" xmlns:cx8="http://schemas.microsoft.com/office/drawing/2016/5/14/chartex" xmlns:mc="http://schemas.openxmlformats.org/markup-compatibility/2006" xmlns:aink="http://schemas.microsoft.com/office/drawing/2016/ink" xmlns:am3d="http://schemas.microsoft.com/office/drawing/2017/model3d" xmlns:o="urn:schemas-microsoft-com:office:office" xmlns:v="urn:schemas-microsoft-com:vml" xmlns:wp14="http://schemas.microsoft.com/office/word/2010/wordprocessingDrawing" xmlns:w10="urn:schemas-microsoft-com:office:word" xmlns:w="http://schemas.openxmlformats.org/wordprocessingml/2006/main" xmlns:w14="http://schemas.microsoft.com/office/word/2010/wordml" xmlns:w15="http://schemas.microsoft.com/office/word/2012/wordml" xmlns:w16cex="http://schemas.microsoft.com/office/word/2018/wordml/cex" xmlns:w16cid="http://schemas.microsoft.com/office/word/2016/wordml/cid" xmlns:w16="http://schemas.microsoft.com/office/word/2018/wordml" xmlns:w16se="http://schemas.microsoft.com/office/word/2015/wordml/symex" xmlns:wpg="http://schemas.microsoft.com/office/word/2010/wordprocessingGroup" xmlns:wpi="http://schemas.microsoft.com/office/word/2010/wordprocessingInk" xmlns:wps="http://schemas.microsoft.com/office/word/2010/wordprocessingShape" xmlns:a14="http://schemas.microsoft.com/office/drawing/2010/main" val="0"/>
@@ -9277,7 +10865,7 @@
       <w:pPr>
         <w:pStyle w:val="1"/>
       </w:pPr>
-      <w:bookmarkStart w:id="16" w:name="_Toc528749158"/>
+      <w:bookmarkStart w:id="16" w:name="_Toc214200094"/>
       <w:r>
         <w:lastRenderedPageBreak/>
         <w:t>Παραδείγματα</w:t>
@@ -9288,7 +10876,7 @@
       <w:pPr>
         <w:pStyle w:val="2"/>
       </w:pPr>
-      <w:bookmarkStart w:id="17" w:name="_Toc528749159"/>
+      <w:bookmarkStart w:id="17" w:name="_Toc214200095"/>
       <w:r>
         <w:t>Παραδείγματα Πινάκων</w:t>
       </w:r>
@@ -9743,7 +11331,7 @@
       <w:pPr>
         <w:pStyle w:val="2"/>
       </w:pPr>
-      <w:bookmarkStart w:id="18" w:name="_Toc528749160"/>
+      <w:bookmarkStart w:id="18" w:name="_Toc214200096"/>
       <w:r>
         <w:t>Παραδείγματα Ερωτημάτων</w:t>
       </w:r>
@@ -10158,7 +11746,7 @@
                     </pic:cNvPicPr>
                   </pic:nvPicPr>
                   <pic:blipFill>
-                    <a:blip r:embed="rId8" cstate="print">
+                    <a:blip r:embed="rId9" cstate="print">
                       <a:extLst>
                         <a:ext uri="{28A0092B-C50C-407E-A947-70E740481C1C}">
                           <a14:useLocalDpi xmlns="" xmlns:wpc="http://schemas.microsoft.com/office/word/2010/wordprocessingCanvas" xmlns:cx="http://schemas.microsoft.com/office/drawing/2014/chartex" xmlns:cx1="http://schemas.microsoft.com/office/drawing/2015/9/8/chartex" xmlns:cx2="http://schemas.microsoft.com/office/drawing/2015/10/21/chartex" xmlns:cx3="http://schemas.microsoft.com/office/drawing/2016/5/9/chartex" xmlns:cx4="http://schemas.microsoft.com/office/drawing/2016/5/10/chartex" xmlns:cx5="http://schemas.microsoft.com/office/drawing/2016/5/11/chartex" xmlns:cx6="http://schemas.microsoft.com/office/drawing/2016/5/12/chartex" xmlns:cx7="http://schemas.microsoft.com/office/drawing/2016/5/13/chartex" xmlns:cx8="http://schemas.microsoft.com/office/drawing/2016/5/14/chartex" xmlns:mc="http://schemas.openxmlformats.org/markup-compatibility/2006" xmlns:aink="http://schemas.microsoft.com/office/drawing/2016/ink" xmlns:am3d="http://schemas.microsoft.com/office/drawing/2017/model3d" xmlns:o="urn:schemas-microsoft-com:office:office" xmlns:v="urn:schemas-microsoft-com:vml" xmlns:wp14="http://schemas.microsoft.com/office/word/2010/wordprocessingDrawing" xmlns:w10="urn:schemas-microsoft-com:office:word" xmlns:w="http://schemas.openxmlformats.org/wordprocessingml/2006/main" xmlns:w14="http://schemas.microsoft.com/office/word/2010/wordml" xmlns:w15="http://schemas.microsoft.com/office/word/2012/wordml" xmlns:w16cex="http://schemas.microsoft.com/office/word/2018/wordml/cex" xmlns:w16cid="http://schemas.microsoft.com/office/word/2016/wordml/cid" xmlns:w16="http://schemas.microsoft.com/office/word/2018/wordml" xmlns:w16se="http://schemas.microsoft.com/office/word/2015/wordml/symex" xmlns:wpg="http://schemas.microsoft.com/office/word/2010/wordprocessingGroup" xmlns:wpi="http://schemas.microsoft.com/office/word/2010/wordprocessingInk" xmlns:wps="http://schemas.microsoft.com/office/word/2010/wordprocessingShape" xmlns:a14="http://schemas.microsoft.com/office/drawing/2010/main" val="0"/>
@@ -11644,6 +13232,18 @@
       <w:lang w:eastAsia="el-GR"/>
     </w:rPr>
   </w:style>
+  <w:style w:type="character" w:styleId="-0">
+    <w:name w:val="FollowedHyperlink"/>
+    <w:basedOn w:val="a0"/>
+    <w:uiPriority w:val="99"/>
+    <w:semiHidden/>
+    <w:unhideWhenUsed/>
+    <w:rsid w:val="00907C0E"/>
+    <w:rPr>
+      <w:color w:val="800080" w:themeColor="followedHyperlink"/>
+      <w:u w:val="single"/>
+    </w:rPr>
+  </w:style>
 </w:styles>
 </file>
 

</xml_diff>